<commit_message>
Conservar casi literalmente el bloque teórico solicitado de OTR
</commit_message>
<xml_diff>
--- a/practica/Practica_kLa.docx
+++ b/practica/Practica_kLa.docx
@@ -283,17 +283,7 @@
         <w:jc w:val="both"/>
       </w:pPr>
       <w:r>
-        <w:rPr>
-          <w:b/>
-          <w:bCs/>
-        </w:rPr>
-        <w:t xml:space="preserve">OTR:</w:t>
-      </w:r>
-      <w:r>
-        <w:t xml:space="preserve"> </w:t>
-      </w:r>
-      <w:r>
-        <w:t xml:space="preserve">velocidad volumétrica de transferencia de oxígeno, por ejemplo, mg O₂·L⁻¹·h⁻¹.</w:t>
+        <w:t xml:space="preserve">OTR: velocidad volumétrica de transferencia de oxígeno, por ejemplo, mg O₂·L⁻¹·h⁻¹.</w:t>
       </w:r>
     </w:p>
     <w:p>
@@ -306,17 +296,7 @@
         <w:jc w:val="both"/>
       </w:pPr>
       <w:r>
-        <w:rPr>
-          <w:b/>
-          <w:bCs/>
-        </w:rPr>
-        <w:t xml:space="preserve">kLa:</w:t>
-      </w:r>
-      <w:r>
-        <w:t xml:space="preserve"> </w:t>
-      </w:r>
-      <w:r>
-        <w:t xml:space="preserve">coeficiente volumétrico de transferencia, h⁻¹.</w:t>
+        <w:t xml:space="preserve">kLa: coeficiente volumétrico de transferencia, h⁻¹.</w:t>
       </w:r>
     </w:p>
     <w:p>
@@ -329,17 +309,7 @@
         <w:jc w:val="both"/>
       </w:pPr>
       <w:r>
-        <w:rPr>
-          <w:b/>
-          <w:bCs/>
-        </w:rPr>
-        <w:t xml:space="preserve">C∗:</w:t>
-      </w:r>
-      <w:r>
-        <w:t xml:space="preserve"> </w:t>
-      </w:r>
-      <w:r>
-        <w:t xml:space="preserve">concentración de saturación o concentración de oxígeno disuelto en equilibrio con la fase gaseosa, mg O₂/L.</w:t>
+        <w:t xml:space="preserve">C∗: concentración de saturación o concentración de oxígeno disuelto en equilibrio con la fase gaseosa, mg O₂/L.</w:t>
       </w:r>
     </w:p>
     <w:p>
@@ -351,18 +321,22 @@
         </w:numPr>
         <w:jc w:val="both"/>
       </w:pPr>
-      <w:r>
-        <w:rPr>
-          <w:b/>
-          <w:bCs/>
-        </w:rPr>
-        <w:t xml:space="preserve">C_L:</w:t>
-      </w:r>
-      <w:r>
-        <w:t xml:space="preserve"> </w:t>
-      </w:r>
-      <w:r>
-        <w:t xml:space="preserve">concentración instantánea de oxígeno disuelto en el líquido, mg O₂/L.</w:t>
+      <m:oMath>
+        <m:sSub>
+          <m:e>
+            <m:r>
+              <m:t>C</m:t>
+            </m:r>
+          </m:e>
+          <m:sub>
+            <m:r>
+              <m:t>L</m:t>
+            </m:r>
+          </m:sub>
+        </m:sSub>
+      </m:oMath>
+      <w:r>
+        <w:t xml:space="preserve">: concentración instantánea de oxígeno disuelto en el líquido, mg O₂/L.</w:t>
       </w:r>
     </w:p>
     <w:p>
@@ -374,18 +348,43 @@
         </w:numPr>
         <w:jc w:val="both"/>
       </w:pPr>
-      <w:r>
-        <w:rPr>
-          <w:b/>
-          <w:bCs/>
-        </w:rPr>
-        <w:t xml:space="preserve">C∗ − C_L:</w:t>
-      </w:r>
-      <w:r>
-        <w:t xml:space="preserve"> </w:t>
-      </w:r>
-      <w:r>
-        <w:t xml:space="preserve">fuerza impulsora para la transferencia de oxígeno.</w:t>
+      <m:oMath>
+        <m:sSup>
+          <m:e>
+            <m:r>
+              <m:t>C</m:t>
+            </m:r>
+          </m:e>
+          <m:sup>
+            <m:r>
+              <m:rPr>
+                <m:sty m:val="p"/>
+              </m:rPr>
+              <m:t>*</m:t>
+            </m:r>
+          </m:sup>
+        </m:sSup>
+        <m:r>
+          <m:rPr>
+            <m:sty m:val="p"/>
+          </m:rPr>
+          <m:t>−</m:t>
+        </m:r>
+        <m:sSub>
+          <m:e>
+            <m:r>
+              <m:t>C</m:t>
+            </m:r>
+          </m:e>
+          <m:sub>
+            <m:r>
+              <m:t>L</m:t>
+            </m:r>
+          </m:sub>
+        </m:sSub>
+      </m:oMath>
+      <w:r>
+        <w:t xml:space="preserve">: fuerza impulsora para la transferencia de oxígeno.</w:t>
       </w:r>
     </w:p>
     <w:p>
@@ -497,7 +496,7 @@
         <w:t xml:space="preserve"> </w:t>
       </w:r>
       <w:r>
-        <w:t xml:space="preserve">es el área interfacial gas–líquido por unidad de volumen de líquido.</w:t>
+        <w:t xml:space="preserve">es el área interfacial gas-líquido por unidad de volumen de líquido.</w:t>
       </w:r>
     </w:p>
     <w:p>
@@ -536,7 +535,7 @@
         <w:jc w:val="both"/>
       </w:pPr>
       <w:r>
-        <w:t xml:space="preserve">En un cultivo celular, la velocidad de transferencia debe compararse con la velocidad de consumo de oxígeno, OUR. En estado estacionario:</w:t>
+        <w:t xml:space="preserve">En un cultivo celular, la velocidad de transferencia debe compararse con la velocidad de consumo de oxígeno (OUR):</w:t>
       </w:r>
     </w:p>
     <w:p>
@@ -650,7 +649,7 @@
           <wp:inline>
             <wp:extent cx="5040000" cy="3136658"/>
             <wp:effectExtent b="0" l="0" r="0" t="0"/>
-            <wp:docPr descr="Diagrama esquemático de un biorreactor agitado. Imagen de las notas técnicas originales; ilustra los componentes del montaje y no identifica el reactor Sartorius utilizado en el taller." title="" id="14" name="Picture"/>
+            <wp:docPr descr="Diagrama esquemático de un biorreactor agitado." title="" id="14" name="Picture"/>
             <a:graphic>
               <a:graphicData uri="http://schemas.openxmlformats.org/drawingml/2006/picture">
                 <pic:pic>
@@ -695,7 +694,7 @@
         <w:jc w:val="center"/>
       </w:pPr>
       <w:r>
-        <w:t xml:space="preserve">Diagrama esquemático de un biorreactor agitado. Imagen de las notas técnicas originales; ilustra los componentes del montaje y no identifica el reactor Sartorius utilizado en el taller.</w:t>
+        <w:t xml:space="preserve">Diagrama esquemático de un biorreactor agitado.</w:t>
       </w:r>
     </w:p>
     <w:bookmarkStart w:id="16" w:name="método-1.-dinámico-de-reoxigenación"/>
@@ -714,7 +713,7 @@
         <w:jc w:val="both"/>
       </w:pPr>
       <w:r>
-        <w:t xml:space="preserve">Primero se desoxigena el medio, después se introduce aire y se registra el incremento del oxígeno disuelto con el tiempo. La medición requiere ausencia de consumo biológico y químico apreciable de oxígeno. Esto no equivale por sí solo a exigir esterilidad: en el taller se utiliza agua sin células añadidas y se supone despreciable el consumo durante el ensayo. Se obtiene kLa mediante una regresión lineal de la respuesta transformada.</w:t>
+        <w:t xml:space="preserve">Primero se desoxigena el medio, después se introduce aire y se registra el incremento del oxígeno disuelto con el tiempo. Todo esto en ausencia de consumo de oxígeno, es decir, en condiciones estériles. En la práctica es adecuado obtener kLa mediante una regresión lineal.</w:t>
       </w:r>
     </w:p>
     <w:bookmarkEnd w:id="16"/>
@@ -734,7 +733,7 @@
         <w:jc w:val="both"/>
       </w:pPr>
       <w:r>
-        <w:t xml:space="preserve">Se modifica temporalmente la aireación o se interrumpe el suministro de oxígeno y se analiza la respuesta del oxígeno disuelto. Se necesita considerar el consumo celular de oxígeno, por lo que el cálculo es más complejo.</w:t>
+        <w:t xml:space="preserve">Se modifica temporalmente la aireación o se interrumpe el suministro de oxígeno y se analiza la respuesta del DO. Se necesita considerar el consumo celular de oxígeno, por lo que el cálculo es más complejo.</w:t>
       </w:r>
     </w:p>
     <w:bookmarkEnd w:id="17"/>
@@ -754,21 +753,12 @@
         <w:jc w:val="both"/>
       </w:pPr>
       <w:r>
-        <w:t xml:space="preserve">Se determina el oxígeno que entra y sale del biorreactor y se calcula la transferencia al líquido. Requiere analizar el gas de salida y corregir los balances por humedad, caudal y composición. El caudal de entrada puede determinarse con controladores de flujo másico y una composición de alimentación conocida; la concentración de oxígeno de salida puede medirse con sensores paramagnéticos en línea. Para cerrar el balance debe conocerse o estimarse también el caudal de salida.</w:t>
-      </w:r>
-    </w:p>
-    <w:p>
-      <w:pPr>
-        <w:pStyle w:val="BodyText"/>
-        <w:jc w:val="both"/>
-      </w:pPr>
-      <w:r>
-        <w:t xml:space="preserve">En esta práctica se utiliza el método dinámico de reoxigenación, con volumen y aireación constantes y distintas velocidades de agitación.</w:t>
+        <w:t xml:space="preserve">Se determina el oxígeno que entra y sale del biorreactor y se calcula la transferencia al líquido. Requiere analizar el gas de salida y corregir los balances por humedad, caudal y composición. El oxígeno que entra se puede determinar con controladores de flujo másico y el de salida mediante sensores paramagnéticos para mediciones en-línea.</w:t>
       </w:r>
     </w:p>
     <w:bookmarkEnd w:id="18"/>
     <w:bookmarkEnd w:id="19"/>
-    <w:bookmarkStart w:id="24" w:name="Xcba4fc177cedf54a6b951eb16cc52b24541368b"/>
+    <w:bookmarkStart w:id="22" w:name="Xcba4fc177cedf54a6b951eb16cc52b24541368b"/>
     <w:p>
       <w:pPr>
         <w:pStyle w:val="Heading1"/>
@@ -795,7 +785,7 @@
         <w:jc w:val="both"/>
       </w:pPr>
       <w:r>
-        <w:t xml:space="preserve">Para un líquido sin células, sin consumo biológico ni químico apreciable de oxígeno y bajo condiciones aproximadamente constantes, el balance es:</w:t>
+        <w:t xml:space="preserve">Para un líquido sin células (sin consumo biológico de oxígeno), sin consumo químico de oxígeno y bajo condiciones aproximadamente constantes, el balance de oxígeno es:</w:t>
       </w:r>
     </w:p>
     <w:p>
@@ -944,27 +934,7 @@
         <w:t xml:space="preserve"> </w:t>
       </w:r>
       <w:r>
-        <w:t xml:space="preserve">y kLa permanecen constantes durante la medición, la integración entre el tiempo inicial</w:t>
-      </w:r>
-      <w:r>
-        <w:t xml:space="preserve"> </w:t>
-      </w:r>
-      <m:oMath>
-        <m:r>
-          <m:t>t</m:t>
-        </m:r>
-        <m:r>
-          <m:rPr>
-            <m:sty m:val="p"/>
-          </m:rPr>
-          <m:t>=</m:t>
-        </m:r>
-        <m:r>
-          <m:t>0</m:t>
-        </m:r>
-      </m:oMath>
-      <w:r>
-        <w:t xml:space="preserve">, con concentración</w:t>
+        <w:t xml:space="preserve">y kLa permanecen constantes durante la medición (por ejemplo, manteniendo la composición de gases de entrada, presión, temperatura, flujo de aireación y agitación constantes), la integración entre el tiempo inicial t = 0, con concentración</w:t>
       </w:r>
       <w:r>
         <w:t xml:space="preserve"> </w:t>
@@ -984,18 +954,7 @@
         </m:sSub>
       </m:oMath>
       <w:r>
-        <w:t xml:space="preserve">, y un tiempo</w:t>
-      </w:r>
-      <w:r>
-        <w:t xml:space="preserve"> </w:t>
-      </w:r>
-      <m:oMath>
-        <m:r>
-          <m:t>t</m:t>
-        </m:r>
-      </m:oMath>
-      <w:r>
-        <w:t xml:space="preserve">, con concentración</w:t>
+        <w:t xml:space="preserve">, y un tiempo t, con concentración</w:t>
       </w:r>
       <w:r>
         <w:t xml:space="preserve"> </w:t>
@@ -1021,165 +980,6 @@
     <w:p>
       <w:pPr>
         <w:pStyle w:val="BodyText"/>
-        <w:keepNext/>
-        <w:jc w:val="center"/>
-      </w:pPr>
-      <m:oMathPara>
-        <m:oMathParaPr>
-          <m:jc m:val="center"/>
-        </m:oMathParaPr>
-        <m:oMath>
-          <m:nary>
-            <m:naryPr>
-              <m:chr m:val="∫"/>
-              <m:limLoc m:val="subSup"/>
-              <m:subHide m:val="off"/>
-              <m:supHide m:val="off"/>
-            </m:naryPr>
-            <m:sub>
-              <m:sSub>
-                <m:e>
-                  <m:r>
-                    <m:t>C</m:t>
-                  </m:r>
-                </m:e>
-                <m:sub>
-                  <m:r>
-                    <m:t>0</m:t>
-                  </m:r>
-                </m:sub>
-              </m:sSub>
-            </m:sub>
-            <m:sup>
-              <m:sSub>
-                <m:e>
-                  <m:r>
-                    <m:t>C</m:t>
-                  </m:r>
-                </m:e>
-                <m:sub>
-                  <m:r>
-                    <m:t>t</m:t>
-                  </m:r>
-                </m:sub>
-              </m:sSub>
-            </m:sup>
-            <m:e>
-              <m:f>
-                <m:fPr>
-                  <m:type m:val="bar"/>
-                </m:fPr>
-                <m:num>
-                  <m:r>
-                    <m:t>d</m:t>
-                  </m:r>
-                  <m:sSub>
-                    <m:e>
-                      <m:r>
-                        <m:t>C</m:t>
-                      </m:r>
-                    </m:e>
-                    <m:sub>
-                      <m:r>
-                        <m:t>L</m:t>
-                      </m:r>
-                    </m:sub>
-                  </m:sSub>
-                </m:num>
-                <m:den>
-                  <m:sSup>
-                    <m:e>
-                      <m:r>
-                        <m:t>C</m:t>
-                      </m:r>
-                    </m:e>
-                    <m:sup>
-                      <m:r>
-                        <m:rPr>
-                          <m:sty m:val="p"/>
-                        </m:rPr>
-                        <m:t>*</m:t>
-                      </m:r>
-                    </m:sup>
-                  </m:sSup>
-                  <m:r>
-                    <m:rPr>
-                      <m:sty m:val="p"/>
-                    </m:rPr>
-                    <m:t>−</m:t>
-                  </m:r>
-                  <m:sSub>
-                    <m:e>
-                      <m:r>
-                        <m:t>C</m:t>
-                      </m:r>
-                    </m:e>
-                    <m:sub>
-                      <m:r>
-                        <m:t>L</m:t>
-                      </m:r>
-                    </m:sub>
-                  </m:sSub>
-                </m:den>
-              </m:f>
-            </m:e>
-          </m:nary>
-          <m:r>
-            <m:rPr>
-              <m:sty m:val="p"/>
-            </m:rPr>
-            <m:t>=</m:t>
-          </m:r>
-          <m:nary>
-            <m:naryPr>
-              <m:chr m:val="∫"/>
-              <m:limLoc m:val="subSup"/>
-              <m:subHide m:val="off"/>
-              <m:supHide m:val="off"/>
-            </m:naryPr>
-            <m:sub>
-              <m:r>
-                <m:t>0</m:t>
-              </m:r>
-            </m:sub>
-            <m:sup>
-              <m:r>
-                <m:t>t</m:t>
-              </m:r>
-            </m:sup>
-            <m:e>
-              <m:sSub>
-                <m:e>
-                  <m:r>
-                    <m:t>k</m:t>
-                  </m:r>
-                </m:e>
-                <m:sub>
-                  <m:r>
-                    <m:t>L</m:t>
-                  </m:r>
-                </m:sub>
-              </m:sSub>
-            </m:e>
-          </m:nary>
-          <m:r>
-            <m:t>a</m:t>
-          </m:r>
-          <m:r>
-            <m:t> </m:t>
-          </m:r>
-          <m:r>
-            <m:t>d</m:t>
-          </m:r>
-          <m:r>
-            <m:t>t</m:t>
-          </m:r>
-        </m:oMath>
-      </m:oMathPara>
-    </w:p>
-    <w:p>
-      <w:pPr>
-        <w:pStyle w:val="FirstParagraph"/>
         <w:keepNext w:val="0"/>
         <w:jc w:val="center"/>
       </w:pPr>
@@ -1317,105 +1117,26 @@
       <w:r>
         <w:t xml:space="preserve">Esta ecuación constituye la base del método.</w:t>
       </w:r>
-      <w:r>
-        <w:t xml:space="preserve"> </w:t>
-      </w:r>
-      <m:oMath>
-        <m:sSub>
-          <m:e>
-            <m:r>
-              <m:t>C</m:t>
-            </m:r>
-          </m:e>
-          <m:sub>
-            <m:r>
-              <m:t>0</m:t>
-            </m:r>
-          </m:sub>
-        </m:sSub>
-      </m:oMath>
-      <w:r>
-        <w:t xml:space="preserve"> </w:t>
-      </w:r>
-      <w:r>
-        <w:t xml:space="preserve">es la concentración inicial y</w:t>
-      </w:r>
-      <w:r>
-        <w:t xml:space="preserve"> </w:t>
-      </w:r>
-      <m:oMath>
-        <m:sSub>
-          <m:e>
-            <m:r>
-              <m:t>C</m:t>
-            </m:r>
-          </m:e>
-          <m:sub>
-            <m:r>
-              <m:t>t</m:t>
-            </m:r>
-          </m:sub>
-        </m:sSub>
-        <m:r>
-          <m:rPr>
-            <m:sty m:val="p"/>
-          </m:rPr>
-          <m:t>=</m:t>
-        </m:r>
-        <m:sSub>
-          <m:e>
-            <m:r>
-              <m:t>C</m:t>
-            </m:r>
-          </m:e>
-          <m:sub>
-            <m:r>
-              <m:t>L</m:t>
-            </m:r>
-          </m:sub>
-        </m:sSub>
-        <m:r>
-          <m:rPr>
-            <m:sty m:val="p"/>
-          </m:rPr>
-          <m:t>(</m:t>
-        </m:r>
-        <m:r>
-          <m:t>t</m:t>
-        </m:r>
-        <m:r>
-          <m:rPr>
-            <m:sty m:val="p"/>
-          </m:rPr>
-          <m:t>)</m:t>
-        </m:r>
-      </m:oMath>
-      <w:r>
-        <w:t xml:space="preserve"> </w:t>
-      </w:r>
-      <w:r>
-        <w:t xml:space="preserve">es la concentración en el tiempo</w:t>
-      </w:r>
-      <w:r>
-        <w:t xml:space="preserve"> </w:t>
-      </w:r>
-      <m:oMath>
-        <m:r>
-          <m:t>t</m:t>
-        </m:r>
-      </m:oMath>
-      <w:r>
-        <w:t xml:space="preserve">. El tiempo se cuenta desde el inicio de la reoxigenación. Deben mantenerse constantes la composición del gas de entrada, la presión, la temperatura, el caudal y la agitación durante cada curva.</w:t>
-      </w:r>
-    </w:p>
-    <w:p>
-      <w:pPr>
-        <w:pStyle w:val="BodyText"/>
+    </w:p>
+    <w:bookmarkEnd w:id="20"/>
+    <w:bookmarkStart w:id="21" w:name="forma-lineal-para-el-cálculo"/>
+    <w:p>
+      <w:pPr>
+        <w:pStyle w:val="Heading2"/>
+        <w:jc w:val="both"/>
+      </w:pPr>
+      <w:r>
+        <w:t xml:space="preserve">4.2. Forma lineal para el cálculo</w:t>
+      </w:r>
+    </w:p>
+    <w:p>
+      <w:pPr>
+        <w:pStyle w:val="FirstParagraph"/>
         <w:keepNext/>
         <w:jc w:val="both"/>
       </w:pPr>
       <w:r>
-        <w:t xml:space="preserve">La ecuación diferencial es de primer orden. Su solución también puede escribirse como:</w:t>
+        <w:t xml:space="preserve">Definimos la variable transformada:</w:t>
       </w:r>
     </w:p>
     <w:p>
@@ -1429,281 +1150,8 @@
           <m:jc m:val="center"/>
         </m:oMathParaPr>
         <m:oMath>
-          <m:sSub>
-            <m:e>
-              <m:r>
-                <m:t>C</m:t>
-              </m:r>
-            </m:e>
-            <m:sub>
-              <m:r>
-                <m:t>t</m:t>
-              </m:r>
-            </m:sub>
-          </m:sSub>
-          <m:r>
-            <m:rPr>
-              <m:sty m:val="p"/>
-            </m:rPr>
-            <m:t>=</m:t>
-          </m:r>
-          <m:sSup>
-            <m:e>
-              <m:r>
-                <m:t>C</m:t>
-              </m:r>
-            </m:e>
-            <m:sup>
-              <m:r>
-                <m:rPr>
-                  <m:sty m:val="p"/>
-                </m:rPr>
-                <m:t>*</m:t>
-              </m:r>
-            </m:sup>
-          </m:sSup>
-          <m:r>
-            <m:rPr>
-              <m:sty m:val="p"/>
-            </m:rPr>
-            <m:t>−</m:t>
-          </m:r>
-          <m:r>
-            <m:rPr>
-              <m:sty m:val="p"/>
-            </m:rPr>
-            <m:t>(</m:t>
-          </m:r>
-          <m:sSup>
-            <m:e>
-              <m:r>
-                <m:t>C</m:t>
-              </m:r>
-            </m:e>
-            <m:sup>
-              <m:r>
-                <m:rPr>
-                  <m:sty m:val="p"/>
-                </m:rPr>
-                <m:t>*</m:t>
-              </m:r>
-            </m:sup>
-          </m:sSup>
-          <m:r>
-            <m:rPr>
-              <m:sty m:val="p"/>
-            </m:rPr>
-            <m:t>−</m:t>
-          </m:r>
-          <m:sSub>
-            <m:e>
-              <m:r>
-                <m:t>C</m:t>
-              </m:r>
-            </m:e>
-            <m:sub>
-              <m:r>
-                <m:t>0</m:t>
-              </m:r>
-            </m:sub>
-          </m:sSub>
-          <m:r>
-            <m:rPr>
-              <m:sty m:val="p"/>
-            </m:rPr>
-            <m:t>)</m:t>
-          </m:r>
-          <m:sSup>
-            <m:e>
-              <m:r>
-                <m:t>e</m:t>
-              </m:r>
-            </m:e>
-            <m:sup>
-              <m:r>
-                <m:rPr>
-                  <m:sty m:val="p"/>
-                </m:rPr>
-                <m:t>−</m:t>
-              </m:r>
-              <m:sSub>
-                <m:e>
-                  <m:r>
-                    <m:t>k</m:t>
-                  </m:r>
-                </m:e>
-                <m:sub>
-                  <m:r>
-                    <m:t>L</m:t>
-                  </m:r>
-                </m:sub>
-              </m:sSub>
-              <m:r>
-                <m:t>a</m:t>
-              </m:r>
-              <m:r>
-                <m:t>t</m:t>
-              </m:r>
-            </m:sup>
-          </m:sSup>
-        </m:oMath>
-      </m:oMathPara>
-    </w:p>
-    <w:p>
-      <w:pPr>
-        <w:pStyle w:val="FirstParagraph"/>
-        <w:jc w:val="both"/>
-      </w:pPr>
-      <w:r>
-        <w:t xml:space="preserve">La constante de tiempo del modelo es</w:t>
-      </w:r>
-      <w:r>
-        <w:t xml:space="preserve"> </w:t>
-      </w:r>
-      <m:oMath>
-        <m:r>
-          <m:t>τ</m:t>
-        </m:r>
-        <m:r>
-          <m:rPr>
-            <m:sty m:val="p"/>
-          </m:rPr>
-          <m:t>=</m:t>
-        </m:r>
-        <m:r>
-          <m:t>1</m:t>
-        </m:r>
-        <m:r>
-          <m:rPr>
-            <m:sty m:val="p"/>
-          </m:rPr>
-          <m:t>/</m:t>
-        </m:r>
-        <m:sSub>
-          <m:e>
-            <m:r>
-              <m:t>k</m:t>
-            </m:r>
-          </m:e>
-          <m:sub>
-            <m:r>
-              <m:t>L</m:t>
-            </m:r>
-          </m:sub>
-        </m:sSub>
-        <m:r>
-          <m:t>a</m:t>
-        </m:r>
-      </m:oMath>
-      <w:r>
-        <w:t xml:space="preserve">, usando unidades de tiempo compatibles. En una τ se recorre el</w:t>
-      </w:r>
-      <w:r>
-        <w:t xml:space="preserve"> </w:t>
-      </w:r>
-      <m:oMath>
-        <m:r>
-          <m:t>1</m:t>
-        </m:r>
-        <m:r>
-          <m:rPr>
-            <m:sty m:val="p"/>
-          </m:rPr>
-          <m:t>−</m:t>
-        </m:r>
-        <m:sSup>
-          <m:e>
-            <m:r>
-              <m:t>e</m:t>
-            </m:r>
-          </m:e>
-          <m:sup>
-            <m:r>
-              <m:rPr>
-                <m:sty m:val="p"/>
-              </m:rPr>
-              <m:t>−</m:t>
-            </m:r>
-            <m:r>
-              <m:t>1</m:t>
-            </m:r>
-          </m:sup>
-        </m:sSup>
-        <m:r>
-          <m:rPr>
-            <m:sty m:val="p"/>
-          </m:rPr>
-          <m:t>≈</m:t>
-        </m:r>
-        <m:r>
-          <m:t>63.2</m:t>
-        </m:r>
-        <m:r>
-          <m:t> </m:t>
-        </m:r>
-        <m:r>
-          <m:rPr>
-            <m:sty m:val="p"/>
-          </m:rPr>
-          <m:t>%</m:t>
-        </m:r>
-      </m:oMath>
-      <w:r>
-        <w:t xml:space="preserve"> </w:t>
-      </w:r>
-      <w:r>
-        <w:t xml:space="preserve">del cambio. Aquí τ describe la transferencia observada en el reactor; no es la constante de tiempo de la sonda aislada.</w:t>
-      </w:r>
-    </w:p>
-    <w:bookmarkEnd w:id="20"/>
-    <w:bookmarkStart w:id="22" w:name="forma-lineal-para-el-cálculo"/>
-    <w:p>
-      <w:pPr>
-        <w:pStyle w:val="Heading2"/>
-        <w:jc w:val="both"/>
-      </w:pPr>
-      <w:r>
-        <w:t xml:space="preserve">4.2. Forma lineal para el cálculo</w:t>
-      </w:r>
-    </w:p>
-    <w:p>
-      <w:pPr>
-        <w:pStyle w:val="FirstParagraph"/>
-        <w:keepNext/>
-        <w:jc w:val="both"/>
-      </w:pPr>
-      <w:r>
-        <w:t xml:space="preserve">Definimos la variable transformada:</w:t>
-      </w:r>
-    </w:p>
-    <w:p>
-      <w:pPr>
-        <w:pStyle w:val="BodyText"/>
-        <w:keepNext w:val="0"/>
-        <w:jc w:val="center"/>
-      </w:pPr>
-      <m:oMathPara>
-        <m:oMathParaPr>
-          <m:jc m:val="center"/>
-        </m:oMathParaPr>
-        <m:oMath>
           <m:r>
             <m:t>Y</m:t>
-          </m:r>
-          <m:r>
-            <m:rPr>
-              <m:sty m:val="p"/>
-            </m:rPr>
-            <m:t>(</m:t>
-          </m:r>
-          <m:r>
-            <m:t>t</m:t>
-          </m:r>
-          <m:r>
-            <m:rPr>
-              <m:sty m:val="p"/>
-            </m:rPr>
-            <m:t>)</m:t>
           </m:r>
           <m:r>
             <m:rPr>
@@ -1812,7 +1260,7 @@
         <w:jc w:val="both"/>
       </w:pPr>
       <w:r>
-        <w:t xml:space="preserve">Al graficar Y contra el tiempo t, se obtiene una recta cuya pendiente es kLa:</w:t>
+        <w:t xml:space="preserve">Al graficar Y contra el tiempo t, se obtiene una recta cuya pendiente es:</w:t>
       </w:r>
     </w:p>
     <w:p>
@@ -2010,30 +1458,11 @@
     <w:p>
       <w:pPr>
         <w:pStyle w:val="FirstParagraph"/>
-        <w:jc w:val="both"/>
-      </w:pPr>
-      <w:r>
-        <w:t xml:space="preserve">Si se utilizan segundos, se multiplica la pendiente por 3600. La plantilla de cálculo del taller utiliza segundos.</w:t>
-      </w:r>
-    </w:p>
-    <w:bookmarkStart w:id="21" w:name="Xaa0067b4e30510f5e9845b634ee35cff26ce5f8"/>
-    <w:p>
-      <w:pPr>
-        <w:pStyle w:val="Heading3"/>
-        <w:jc w:val="both"/>
-      </w:pPr>
-      <w:r>
-        <w:t xml:space="preserve">Oxígeno disuelto en porcentaje de saturación</w:t>
-      </w:r>
-    </w:p>
-    <w:p>
-      <w:pPr>
-        <w:pStyle w:val="FirstParagraph"/>
         <w:keepNext/>
         <w:jc w:val="both"/>
       </w:pPr>
       <w:r>
-        <w:t xml:space="preserve">Si la lectura es proporcional a la concentración y el 100 % representa la saturación de equilibrio, puede utilizarse directamente:</w:t>
+        <w:t xml:space="preserve">Alternativa con oxígeno disuelto en porcentaje de saturación: si la lectura de DO es proporcional a la concentración y el 100 % representa la saturación de equilibrio, puede utilizarse directamente:</w:t>
       </w:r>
     </w:p>
     <w:p>
@@ -2047,30 +1476,6 @@
           <m:jc m:val="center"/>
         </m:oMathParaPr>
         <m:oMath>
-          <m:r>
-            <m:t>Y</m:t>
-          </m:r>
-          <m:r>
-            <m:rPr>
-              <m:sty m:val="p"/>
-            </m:rPr>
-            <m:t>(</m:t>
-          </m:r>
-          <m:r>
-            <m:t>t</m:t>
-          </m:r>
-          <m:r>
-            <m:rPr>
-              <m:sty m:val="p"/>
-            </m:rPr>
-            <m:t>)</m:t>
-          </m:r>
-          <m:r>
-            <m:rPr>
-              <m:sty m:val="p"/>
-            </m:rPr>
-            <m:t>=</m:t>
-          </m:r>
           <m:r>
             <m:rPr>
               <m:sty m:val="p"/>
@@ -2102,7 +1507,7 @@
                   <m:sSub>
                     <m:e>
                       <m:r>
-                        <m:t>y</m:t>
+                        <m:t>C</m:t>
                       </m:r>
                     </m:e>
                     <m:sub>
@@ -2122,24 +1527,18 @@
                     </m:rPr>
                     <m:t>−</m:t>
                   </m:r>
-                  <m:r>
-                    <m:t>y</m:t>
-                  </m:r>
-                  <m:r>
-                    <m:rPr>
-                      <m:sty m:val="p"/>
-                    </m:rPr>
-                    <m:t>(</m:t>
-                  </m:r>
-                  <m:r>
-                    <m:t>t</m:t>
-                  </m:r>
-                  <m:r>
-                    <m:rPr>
-                      <m:sty m:val="p"/>
-                    </m:rPr>
-                    <m:t>)</m:t>
-                  </m:r>
+                  <m:sSub>
+                    <m:e>
+                      <m:r>
+                        <m:t>C</m:t>
+                      </m:r>
+                    </m:e>
+                    <m:sub>
+                      <m:r>
+                        <m:t>t</m:t>
+                      </m:r>
+                    </m:sub>
+                  </m:sSub>
                 </m:den>
               </m:f>
             </m:e>
@@ -2177,11 +1576,777 @@
     <w:p>
       <w:pPr>
         <w:pStyle w:val="FirstParagraph"/>
+        <w:jc w:val="both"/>
+      </w:pPr>
+      <w:r>
+        <w:t xml:space="preserve">Esta expresión requiere que la saturación de equilibrio corresponda efectivamente al 100 % de la escala utilizada. Si la sonda utiliza otra referencia o cambia la presión, la temperatura o la composición del gas, debe emplearse el valor de equilibrio apropiado.</w:t>
+      </w:r>
+    </w:p>
+    <w:bookmarkEnd w:id="21"/>
+    <w:bookmarkEnd w:id="22"/>
+    <w:bookmarkStart w:id="30" w:name="protocolo-experimental"/>
+    <w:p>
+      <w:pPr>
+        <w:pStyle w:val="Heading1"/>
+        <w:jc w:val="both"/>
+      </w:pPr>
+      <w:r>
+        <w:t xml:space="preserve">5. Protocolo experimental</w:t>
+      </w:r>
+    </w:p>
+    <w:bookmarkStart w:id="26" w:name="condiciones-de-operación"/>
+    <w:p>
+      <w:pPr>
+        <w:pStyle w:val="Heading2"/>
+        <w:jc w:val="both"/>
+      </w:pPr>
+      <w:r>
+        <w:t xml:space="preserve">5.1. Condiciones de operación</w:t>
+      </w:r>
+    </w:p>
+    <w:tbl>
+      <w:tblPr>
+        <w:tblStyle w:val="Table"/>
+        <w:tblW w:type="pct" w:w="5000"/>
+        <w:jc w:val="center"/>
+        <w:tblBorders>
+          <w:top w:val="single" w:sz="4" w:space="0" w:color="B7AFC6"/>
+          <w:left w:val="single" w:sz="4" w:space="0" w:color="B7AFC6"/>
+          <w:bottom w:val="single" w:sz="4" w:space="0" w:color="B7AFC6"/>
+          <w:right w:val="single" w:sz="4" w:space="0" w:color="B7AFC6"/>
+          <w:insideH w:val="single" w:sz="4" w:space="0" w:color="B7AFC6"/>
+          <w:insideV w:val="single" w:sz="4" w:space="0" w:color="B7AFC6"/>
+        </w:tblBorders>
+        <w:tblLayout w:type="fixed"/>
+        <w:tblCellMar>
+          <w:top w:w="50" w:type="dxa"/>
+          <w:left w:w="100" w:type="dxa"/>
+          <w:bottom w:w="50" w:type="dxa"/>
+          <w:right w:w="100" w:type="dxa"/>
+        </w:tblCellMar>
+        <w:tblLook w:firstRow="1" w:lastRow="0" w:firstColumn="0" w:lastColumn="0" w:noHBand="0" w:noVBand="0" w:val="0020"/>
+      </w:tblPr>
+      <w:tblGrid>
+        <w:gridCol w:w="3960"/>
+        <w:gridCol w:w="3960"/>
+      </w:tblGrid>
+      <w:tr>
+        <w:trPr>
+          <w:cantSplit/>
+          <w:tblHeader/>
+        </w:trPr>
+        <w:tc>
+          <w:tcPr>
+            <w:shd w:val="clear" w:color="auto" w:fill="4E2891"/>
+          </w:tcPr>
+          <w:p>
+            <w:pPr>
+              <w:pStyle w:val="Compact"/>
+              <w:jc w:val="both"/>
+            </w:pPr>
+            <w:r>
+              <w:rPr>
+                <w:b/>
+                <w:color w:val="FFFFFF"/>
+              </w:rPr>
+              <w:t xml:space="preserve">Parámetro</w:t>
+            </w:r>
+          </w:p>
+        </w:tc>
+        <w:tc>
+          <w:tcPr>
+            <w:shd w:val="clear" w:color="auto" w:fill="4E2891"/>
+          </w:tcPr>
+          <w:p>
+            <w:pPr>
+              <w:pStyle w:val="Compact"/>
+              <w:jc w:val="both"/>
+            </w:pPr>
+            <w:r>
+              <w:rPr>
+                <w:b/>
+                <w:color w:val="FFFFFF"/>
+              </w:rPr>
+              <w:t xml:space="preserve">Condición</w:t>
+            </w:r>
+          </w:p>
+        </w:tc>
+      </w:tr>
+      <w:tr>
+        <w:trPr>
+          <w:cantSplit/>
+        </w:trPr>
+        <w:tc>
+          <w:tcPr/>
+          <w:p>
+            <w:pPr>
+              <w:pStyle w:val="Compact"/>
+              <w:jc w:val="both"/>
+            </w:pPr>
+            <w:r>
+              <w:t xml:space="preserve">Reactor</w:t>
+            </w:r>
+          </w:p>
+        </w:tc>
+        <w:tc>
+          <w:tcPr/>
+          <w:p>
+            <w:pPr>
+              <w:pStyle w:val="Compact"/>
+              <w:jc w:val="both"/>
+            </w:pPr>
+            <w:r>
+              <w:t xml:space="preserve">Sartorius, capacidad nominal de 50 L</w:t>
+            </w:r>
+          </w:p>
+        </w:tc>
+      </w:tr>
+      <w:tr>
+        <w:trPr>
+          <w:cantSplit/>
+        </w:trPr>
+        <w:tc>
+          <w:tcPr/>
+          <w:p>
+            <w:pPr>
+              <w:pStyle w:val="Compact"/>
+              <w:jc w:val="both"/>
+            </w:pPr>
+            <w:r>
+              <w:t xml:space="preserve">Volumen de trabajo</w:t>
+            </w:r>
+          </w:p>
+        </w:tc>
+        <w:tc>
+          <w:tcPr/>
+          <w:p>
+            <w:pPr>
+              <w:pStyle w:val="Compact"/>
+              <w:jc w:val="both"/>
+            </w:pPr>
+            <w:r>
+              <w:t xml:space="preserve">30 L de agua</w:t>
+            </w:r>
+          </w:p>
+        </w:tc>
+      </w:tr>
+      <w:tr>
+        <w:trPr>
+          <w:cantSplit/>
+        </w:trPr>
+        <w:tc>
+          <w:tcPr/>
+          <w:p>
+            <w:pPr>
+              <w:pStyle w:val="Compact"/>
+              <w:jc w:val="both"/>
+            </w:pPr>
+            <w:r>
+              <w:t xml:space="preserve">Aireación durante la reoxigenación</w:t>
+            </w:r>
+          </w:p>
+        </w:tc>
+        <w:tc>
+          <w:tcPr/>
+          <w:p>
+            <w:pPr>
+              <w:pStyle w:val="Compact"/>
+              <w:jc w:val="both"/>
+            </w:pPr>
+            <w:r>
+              <w:t xml:space="preserve">0.5 vvm constantes =</w:t>
+            </w:r>
+            <w:r>
+              <w:t xml:space="preserve"> </w:t>
+            </w:r>
+            <w:r>
+              <w:rPr>
+                <w:b/>
+                <w:bCs/>
+              </w:rPr>
+              <w:t xml:space="preserve">15 L/min</w:t>
+            </w:r>
+          </w:p>
+        </w:tc>
+      </w:tr>
+      <w:tr>
+        <w:trPr>
+          <w:cantSplit/>
+        </w:trPr>
+        <w:tc>
+          <w:tcPr/>
+          <w:p>
+            <w:pPr>
+              <w:pStyle w:val="Compact"/>
+              <w:jc w:val="both"/>
+            </w:pPr>
+            <w:r>
+              <w:t xml:space="preserve">Agitación del barrido</w:t>
+            </w:r>
+          </w:p>
+        </w:tc>
+        <w:tc>
+          <w:tcPr/>
+          <w:p>
+            <w:pPr>
+              <w:pStyle w:val="Compact"/>
+              <w:jc w:val="both"/>
+            </w:pPr>
+            <w:r>
+              <w:t xml:space="preserve">200, 400, 600, 800 y 1000 rpm</w:t>
+            </w:r>
+          </w:p>
+        </w:tc>
+      </w:tr>
+      <w:tr>
+        <w:trPr>
+          <w:cantSplit/>
+        </w:trPr>
+        <w:tc>
+          <w:tcPr/>
+          <w:p>
+            <w:pPr>
+              <w:pStyle w:val="Compact"/>
+              <w:jc w:val="both"/>
+            </w:pPr>
+            <w:r>
+              <w:t xml:space="preserve">Temperatura</w:t>
+            </w:r>
+          </w:p>
+        </w:tc>
+        <w:tc>
+          <w:tcPr/>
+          <w:p>
+            <w:pPr>
+              <w:pStyle w:val="Compact"/>
+              <w:jc w:val="both"/>
+            </w:pPr>
+            <w:r>
+              <w:t xml:space="preserve">Registrar y mantener constante durante el barrido</w:t>
+            </w:r>
+          </w:p>
+        </w:tc>
+      </w:tr>
+      <w:tr>
+        <w:trPr>
+          <w:cantSplit/>
+        </w:trPr>
+        <w:tc>
+          <w:tcPr/>
+          <w:p>
+            <w:pPr>
+              <w:pStyle w:val="Compact"/>
+              <w:jc w:val="both"/>
+            </w:pPr>
+            <w:r>
+              <w:t xml:space="preserve">Presión</w:t>
+            </w:r>
+          </w:p>
+        </w:tc>
+        <w:tc>
+          <w:tcPr/>
+          <w:p>
+            <w:pPr>
+              <w:pStyle w:val="Compact"/>
+              <w:jc w:val="both"/>
+            </w:pPr>
+            <w:r>
+              <w:t xml:space="preserve">Registrar la disponible y mantener las mismas condiciones de venteo</w:t>
+            </w:r>
+          </w:p>
+        </w:tc>
+      </w:tr>
+      <w:tr>
+        <w:trPr>
+          <w:cantSplit/>
+        </w:trPr>
+        <w:tc>
+          <w:tcPr/>
+          <w:p>
+            <w:pPr>
+              <w:pStyle w:val="Compact"/>
+              <w:jc w:val="both"/>
+            </w:pPr>
+            <w:r>
+              <w:t xml:space="preserve">Consumo biológico</w:t>
+            </w:r>
+          </w:p>
+        </w:tc>
+        <w:tc>
+          <w:tcPr/>
+          <w:p>
+            <w:pPr>
+              <w:pStyle w:val="Compact"/>
+              <w:jc w:val="both"/>
+            </w:pPr>
+            <w:r>
+              <w:t xml:space="preserve">Sin células</w:t>
+            </w:r>
+          </w:p>
+        </w:tc>
+      </w:tr>
+      <w:tr>
+        <w:trPr>
+          <w:cantSplit/>
+        </w:trPr>
+        <w:tc>
+          <w:tcPr/>
+          <w:p>
+            <w:pPr>
+              <w:pStyle w:val="Compact"/>
+              <w:jc w:val="both"/>
+            </w:pPr>
+            <w:r>
+              <w:t xml:space="preserve">Control de oxígeno</w:t>
+            </w:r>
+          </w:p>
+        </w:tc>
+        <w:tc>
+          <w:tcPr/>
+          <w:p>
+            <w:pPr>
+              <w:pStyle w:val="Compact"/>
+              <w:jc w:val="both"/>
+            </w:pPr>
+            <w:r>
+              <w:t xml:space="preserve">Desactivado; ninguna cascada debe cambiar rpm o gases</w:t>
+            </w:r>
+          </w:p>
+        </w:tc>
+      </w:tr>
+      <w:tr>
+        <w:trPr>
+          <w:cantSplit/>
+        </w:trPr>
+        <w:tc>
+          <w:tcPr/>
+          <w:p>
+            <w:pPr>
+              <w:pStyle w:val="Compact"/>
+              <w:jc w:val="both"/>
+            </w:pPr>
+            <w:r>
+              <w:t xml:space="preserve">Registro</w:t>
+            </w:r>
+          </w:p>
+        </w:tc>
+        <w:tc>
+          <w:tcPr/>
+          <w:p>
+            <w:pPr>
+              <w:pStyle w:val="Compact"/>
+              <w:jc w:val="both"/>
+            </w:pPr>
+            <w:r>
+              <w:t xml:space="preserve">Oxígeno, tiempo, rpm, caudal y temperatura; adquisición digital preferentemente cada 1 s</w:t>
+            </w:r>
+          </w:p>
+        </w:tc>
+      </w:tr>
+    </w:tbl>
+    <w:p>
+      <w:pPr>
+        <w:pStyle w:val="BodyText"/>
+        <w:spacing w:before="160"/>
+        <w:jc w:val="both"/>
+      </w:pPr>
+      <w:r>
+        <w:t xml:space="preserve">vvm expresa litros de gas por litro de líquido y minuto. El caudal se calcula con los</w:t>
+      </w:r>
+      <w:r>
+        <w:t xml:space="preserve"> </w:t>
+      </w:r>
+      <w:r>
+        <w:rPr>
+          <w:b/>
+          <w:bCs/>
+        </w:rPr>
+        <w:t xml:space="preserve">30 L de trabajo</w:t>
+      </w:r>
+      <w:r>
+        <w:t xml:space="preserve">, no con la capacidad nominal:</w:t>
+      </w:r>
+      <w:r>
+        <w:t xml:space="preserve"> </w:t>
+      </w:r>
+      <m:oMath>
+        <m:r>
+          <m:t>0.5</m:t>
+        </m:r>
+        <m:r>
+          <m:rPr>
+            <m:sty m:val="p"/>
+          </m:rPr>
+          <m:t>×</m:t>
+        </m:r>
+        <m:r>
+          <m:t>30</m:t>
+        </m:r>
+        <m:r>
+          <m:rPr>
+            <m:sty m:val="p"/>
+          </m:rPr>
+          <m:t>=</m:t>
+        </m:r>
+        <m:r>
+          <m:t>15</m:t>
+        </m:r>
+      </m:oMath>
+      <w:r>
+        <w:t xml:space="preserve"> </w:t>
+      </w:r>
+      <w:r>
+        <w:t xml:space="preserve">L/min. Registrar la referencia del caudalímetro o controlador de flujo disponible.</w:t>
+      </w:r>
+    </w:p>
+    <w:p>
+      <w:pPr>
+        <w:pStyle w:val="BodyText"/>
+        <w:jc w:val="both"/>
+      </w:pPr>
+      <w:r>
+        <w:t xml:space="preserve">La secuencia propuesta es ascendente, con una curva independiente en cada nivel. Durante cada reoxigenación las rpm permanecen constantes. No se obtiene un kLa por nivel cambiando las rpm sobre una única curva ni aumentando la agitación cuando el agua ya está saturada.</w:t>
+      </w:r>
+    </w:p>
+    <w:p>
+      <w:pPr>
+        <w:pStyle w:val="CaptionedFigure"/>
         <w:keepNext/>
-        <w:jc w:val="both"/>
-      </w:pPr>
-      <w:r>
-        <w:t xml:space="preserve">Aquí</w:t>
+        <w:jc w:val="center"/>
+      </w:pPr>
+      <w:r>
+        <w:drawing>
+          <wp:inline>
+            <wp:extent cx="5040000" cy="1238787"/>
+            <wp:effectExtent b="0" l="0" r="0" t="0"/>
+            <wp:docPr descr="Secuencia del barrido a volumen y aireación constantes" title="" id="24" name="Picture"/>
+            <a:graphic>
+              <a:graphicData uri="http://schemas.openxmlformats.org/drawingml/2006/picture">
+                <pic:pic>
+                  <pic:nvPicPr>
+                    <pic:cNvPr descr="../figuras/01_barrido_kLa.png" id="25" name="Picture"/>
+                    <pic:cNvPicPr>
+                      <a:picLocks noChangeArrowheads="1" noChangeAspect="1"/>
+                    </pic:cNvPicPr>
+                  </pic:nvPicPr>
+                  <pic:blipFill>
+                    <a:blip r:embed="rId23"/>
+                    <a:stretch>
+                      <a:fillRect/>
+                    </a:stretch>
+                  </pic:blipFill>
+                  <pic:spPr bwMode="auto">
+                    <a:xfrm>
+                      <a:off x="0" y="0"/>
+                      <a:ext cx="5040000" cy="1238787"/>
+                    </a:xfrm>
+                    <a:prstGeom prst="rect">
+                      <a:avLst/>
+                    </a:prstGeom>
+                    <a:noFill/>
+                    <a:ln w="9525">
+                      <a:noFill/>
+                      <a:headEnd/>
+                      <a:tailEnd/>
+                    </a:ln>
+                  </pic:spPr>
+                </pic:pic>
+              </a:graphicData>
+            </a:graphic>
+          </wp:inline>
+        </w:drawing>
+      </w:r>
+    </w:p>
+    <w:p>
+      <w:pPr>
+        <w:pStyle w:val="ImageCaption"/>
+        <w:keepNext w:val="0"/>
+        <w:jc w:val="center"/>
+      </w:pPr>
+      <w:r>
+        <w:t xml:space="preserve">Secuencia del barrido a volumen y aireación constantes</w:t>
+      </w:r>
+    </w:p>
+    <w:bookmarkEnd w:id="26"/>
+    <w:bookmarkStart w:id="27" w:name="organización-y-adquisición"/>
+    <w:p>
+      <w:pPr>
+        <w:pStyle w:val="Heading2"/>
+        <w:jc w:val="both"/>
+      </w:pPr>
+      <w:r>
+        <w:t xml:space="preserve">5.2. Organización y adquisición</w:t>
+      </w:r>
+    </w:p>
+    <w:p>
+      <w:pPr>
+        <w:pStyle w:val="FirstParagraph"/>
+        <w:jc w:val="both"/>
+      </w:pPr>
+      <w:r>
+        <w:t xml:space="preserve">Distribuir las tareas de operación, tiempo, adquisición, revisión de condiciones, cálculo y verificación. La maniobra de gases se realiza con el instructor.</w:t>
+      </w:r>
+    </w:p>
+    <w:tbl>
+      <w:tblPr>
+        <w:tblStyle w:val="Table"/>
+        <w:tblW w:type="pct" w:w="5000"/>
+        <w:jc w:val="center"/>
+        <w:tblBorders>
+          <w:top w:val="single" w:sz="4" w:space="0" w:color="B7AFC6"/>
+          <w:left w:val="single" w:sz="4" w:space="0" w:color="B7AFC6"/>
+          <w:bottom w:val="single" w:sz="4" w:space="0" w:color="B7AFC6"/>
+          <w:right w:val="single" w:sz="4" w:space="0" w:color="B7AFC6"/>
+          <w:insideH w:val="single" w:sz="4" w:space="0" w:color="B7AFC6"/>
+          <w:insideV w:val="single" w:sz="4" w:space="0" w:color="B7AFC6"/>
+        </w:tblBorders>
+        <w:tblLayout w:type="fixed"/>
+        <w:tblCellMar>
+          <w:top w:w="50" w:type="dxa"/>
+          <w:left w:w="100" w:type="dxa"/>
+          <w:bottom w:w="50" w:type="dxa"/>
+          <w:right w:w="100" w:type="dxa"/>
+        </w:tblCellMar>
+        <w:tblLook w:firstRow="1" w:lastRow="0" w:firstColumn="0" w:lastColumn="0" w:noHBand="0" w:noVBand="0" w:val="0020"/>
+      </w:tblPr>
+      <w:tblGrid>
+        <w:gridCol w:w="3960"/>
+        <w:gridCol w:w="3960"/>
+      </w:tblGrid>
+      <w:tr>
+        <w:trPr>
+          <w:cantSplit/>
+          <w:tblHeader/>
+        </w:trPr>
+        <w:tc>
+          <w:tcPr>
+            <w:shd w:val="clear" w:color="auto" w:fill="4E2891"/>
+          </w:tcPr>
+          <w:p>
+            <w:pPr>
+              <w:pStyle w:val="Compact"/>
+              <w:jc w:val="both"/>
+            </w:pPr>
+            <w:r>
+              <w:rPr>
+                <w:b/>
+                <w:color w:val="FFFFFF"/>
+              </w:rPr>
+              <w:t xml:space="preserve">Tiempo orientativo</w:t>
+            </w:r>
+          </w:p>
+        </w:tc>
+        <w:tc>
+          <w:tcPr>
+            <w:shd w:val="clear" w:color="auto" w:fill="4E2891"/>
+          </w:tcPr>
+          <w:p>
+            <w:pPr>
+              <w:pStyle w:val="Compact"/>
+              <w:jc w:val="both"/>
+            </w:pPr>
+            <w:r>
+              <w:rPr>
+                <w:b/>
+                <w:color w:val="FFFFFF"/>
+              </w:rPr>
+              <w:t xml:space="preserve">Actividad</w:t>
+            </w:r>
+          </w:p>
+        </w:tc>
+      </w:tr>
+      <w:tr>
+        <w:trPr>
+          <w:cantSplit/>
+        </w:trPr>
+        <w:tc>
+          <w:tcPr/>
+          <w:p>
+            <w:pPr>
+              <w:pStyle w:val="Compact"/>
+              <w:jc w:val="both"/>
+            </w:pPr>
+            <w:r>
+              <w:t xml:space="preserve">0–5 min</w:t>
+            </w:r>
+          </w:p>
+        </w:tc>
+        <w:tc>
+          <w:tcPr/>
+          <w:p>
+            <w:pPr>
+              <w:pStyle w:val="Compact"/>
+              <w:jc w:val="both"/>
+            </w:pPr>
+            <w:r>
+              <w:t xml:space="preserve">Identificar equipo y sonda; verificar volumen, aire, temperatura, adquisición y salidas en manual.</w:t>
+            </w:r>
+          </w:p>
+        </w:tc>
+      </w:tr>
+      <w:tr>
+        <w:trPr>
+          <w:cantSplit/>
+        </w:trPr>
+        <w:tc>
+          <w:tcPr/>
+          <w:p>
+            <w:pPr>
+              <w:pStyle w:val="Compact"/>
+              <w:jc w:val="both"/>
+            </w:pPr>
+            <w:r>
+              <w:t xml:space="preserve">5–30 min</w:t>
+            </w:r>
+          </w:p>
+        </w:tc>
+        <w:tc>
+          <w:tcPr/>
+          <w:p>
+            <w:pPr>
+              <w:pStyle w:val="Compact"/>
+              <w:jc w:val="both"/>
+            </w:pPr>
+            <w:r>
+              <w:t xml:space="preserve">Registrar las cinco curvas, con desoxigenación y reoxigenación en cada velocidad. Calcular conforme se obtienen los registros.</w:t>
+            </w:r>
+          </w:p>
+        </w:tc>
+      </w:tr>
+      <w:tr>
+        <w:trPr>
+          <w:cantSplit/>
+        </w:trPr>
+        <w:tc>
+          <w:tcPr/>
+          <w:p>
+            <w:pPr>
+              <w:pStyle w:val="Compact"/>
+              <w:jc w:val="both"/>
+            </w:pPr>
+            <w:r>
+              <w:t xml:space="preserve">30–40 min</w:t>
+            </w:r>
+          </w:p>
+        </w:tc>
+        <w:tc>
+          <w:tcPr/>
+          <w:p>
+            <w:pPr>
+              <w:pStyle w:val="Compact"/>
+              <w:jc w:val="both"/>
+            </w:pPr>
+            <w:r>
+              <w:t xml:space="preserve">Revisar mesetas y ajustes, completar la tabla y construir el barrido.</w:t>
+            </w:r>
+          </w:p>
+        </w:tc>
+      </w:tr>
+      <w:tr>
+        <w:trPr>
+          <w:cantSplit/>
+        </w:trPr>
+        <w:tc>
+          <w:tcPr/>
+          <w:p>
+            <w:pPr>
+              <w:pStyle w:val="Compact"/>
+              <w:jc w:val="both"/>
+            </w:pPr>
+            <w:r>
+              <w:t xml:space="preserve">40–45 min</w:t>
+            </w:r>
+          </w:p>
+        </w:tc>
+        <w:tc>
+          <w:tcPr/>
+          <w:p>
+            <w:pPr>
+              <w:pStyle w:val="Compact"/>
+              <w:jc w:val="both"/>
+            </w:pPr>
+            <w:r>
+              <w:t xml:space="preserve">Comparar resultados y documentar curvas incompletas o incidentes.</w:t>
+            </w:r>
+          </w:p>
+        </w:tc>
+      </w:tr>
+    </w:tbl>
+    <w:p>
+      <w:pPr>
+        <w:pStyle w:val="BodyText"/>
+        <w:spacing w:before="160"/>
+        <w:jc w:val="both"/>
+      </w:pPr>
+      <w:r>
+        <w:t xml:space="preserve">La adquisición del barrido se probó en el laboratorio en aproximadamente 30 minutos, según las notas de preparación del taller. Reservar hasta 45 minutos para que cada equipo complete el análisis. Los tiempos por curva dependen de la respuesta observada; no sustituir una meseta ausente por el último dato para cumplir el cronograma.</w:t>
+      </w:r>
+    </w:p>
+    <w:bookmarkEnd w:id="27"/>
+    <w:bookmarkStart w:id="28" w:name="cálculo-con-los-registros-del-taller"/>
+    <w:p>
+      <w:pPr>
+        <w:pStyle w:val="Heading2"/>
+        <w:jc w:val="both"/>
+      </w:pPr>
+      <w:r>
+        <w:t xml:space="preserve">Cálculo con los registros del taller</w:t>
+      </w:r>
+    </w:p>
+    <w:p>
+      <w:pPr>
+        <w:pStyle w:val="FirstParagraph"/>
+        <w:keepNext/>
+        <w:jc w:val="both"/>
+      </w:pPr>
+      <w:r>
+        <w:t xml:space="preserve">En la fórmula con 100 %,</w:t>
+      </w:r>
+      <w:r>
+        <w:t xml:space="preserve"> </w:t>
+      </w:r>
+      <m:oMath>
+        <m:sSub>
+          <m:e>
+            <m:r>
+              <m:t>C</m:t>
+            </m:r>
+          </m:e>
+          <m:sub>
+            <m:r>
+              <m:t>0</m:t>
+            </m:r>
+          </m:sub>
+        </m:sSub>
+      </m:oMath>
+      <w:r>
+        <w:t xml:space="preserve"> </w:t>
+      </w:r>
+      <w:r>
+        <w:t xml:space="preserve">y</w:t>
+      </w:r>
+      <w:r>
+        <w:t xml:space="preserve"> </w:t>
+      </w:r>
+      <m:oMath>
+        <m:sSub>
+          <m:e>
+            <m:r>
+              <m:t>C</m:t>
+            </m:r>
+          </m:e>
+          <m:sub>
+            <m:r>
+              <m:t>t</m:t>
+            </m:r>
+          </m:sub>
+        </m:sSub>
+      </m:oMath>
+      <w:r>
+        <w:t xml:space="preserve"> </w:t>
+      </w:r>
+      <w:r>
+        <w:t xml:space="preserve">representan lecturas en porcentaje de saturación. Para el análisis del taller se utilizan</w:t>
       </w:r>
       <w:r>
         <w:t xml:space="preserve"> </w:t>
@@ -2201,10 +2366,7 @@
         </m:sSub>
       </m:oMath>
       <w:r>
-        <w:t xml:space="preserve"> </w:t>
-      </w:r>
-      <w:r>
-        <w:t xml:space="preserve">y</w:t>
+        <w:t xml:space="preserve">,</w:t>
       </w:r>
       <w:r>
         <w:t xml:space="preserve"> </w:t>
@@ -2233,7 +2395,30 @@
         <w:t xml:space="preserve"> </w:t>
       </w:r>
       <w:r>
-        <w:t xml:space="preserve">son las lecturas inicial e instantánea, ambas en porcentaje de saturación. Esta expresión requiere que el equilibrio corresponda efectivamente al 100 % de la escala utilizada. Si la sonda usa otra referencia o cambian presión, temperatura o composición gaseosa, debe emplearse el valor de equilibrio apropiado:</w:t>
+        <w:t xml:space="preserve">y la meseta final observada</w:t>
+      </w:r>
+      <w:r>
+        <w:t xml:space="preserve"> </w:t>
+      </w:r>
+      <m:oMath>
+        <m:sSub>
+          <m:e>
+            <m:r>
+              <m:t>y</m:t>
+            </m:r>
+          </m:e>
+          <m:sub>
+            <m:r>
+              <m:rPr>
+                <m:sty m:val="p"/>
+              </m:rPr>
+              <m:t>∞</m:t>
+            </m:r>
+          </m:sub>
+        </m:sSub>
+      </m:oMath>
+      <w:r>
+        <w:t xml:space="preserve">, todas en la misma escala:</w:t>
       </w:r>
     </w:p>
     <w:p>
@@ -2374,207 +2559,11 @@
     <w:p>
       <w:pPr>
         <w:pStyle w:val="FirstParagraph"/>
-        <w:jc w:val="both"/>
-      </w:pPr>
-      <m:oMath>
-        <m:sSub>
-          <m:e>
-            <m:r>
-              <m:t>y</m:t>
-            </m:r>
-          </m:e>
-          <m:sub>
-            <m:r>
-              <m:rPr>
-                <m:sty m:val="p"/>
-              </m:rPr>
-              <m:t>∞</m:t>
-            </m:r>
-          </m:sub>
-        </m:sSub>
-      </m:oMath>
-      <w:r>
-        <w:t xml:space="preserve"> </w:t>
-      </w:r>
-      <w:r>
-        <w:t xml:space="preserve">es la meseta final con aire. En el taller se utiliza la meseta observada en las condiciones de cada ensayo, sin sustituirla automáticamente por 100 %.</w:t>
-      </w:r>
-    </w:p>
-    <w:p>
-      <w:pPr>
-        <w:pStyle w:val="BodyText"/>
-        <w:jc w:val="both"/>
-      </w:pPr>
-      <w:r>
-        <w:t xml:space="preserve">Se ajusta una recta</w:t>
-      </w:r>
-      <w:r>
-        <w:t xml:space="preserve"> </w:t>
-      </w:r>
-      <m:oMath>
-        <m:r>
-          <m:t>Y</m:t>
-        </m:r>
-        <m:r>
-          <m:rPr>
-            <m:sty m:val="p"/>
-          </m:rPr>
-          <m:t>=</m:t>
-        </m:r>
-        <m:r>
-          <m:t>a</m:t>
-        </m:r>
-        <m:r>
-          <m:rPr>
-            <m:sty m:val="p"/>
-          </m:rPr>
-          <m:t>+</m:t>
-        </m:r>
-        <m:r>
-          <m:t>b</m:t>
-        </m:r>
-        <m:r>
-          <m:t>t</m:t>
-        </m:r>
-      </m:oMath>
-      <w:r>
-        <w:t xml:space="preserve">; su pendiente</w:t>
-      </w:r>
-      <w:r>
-        <w:t xml:space="preserve"> </w:t>
-      </w:r>
-      <m:oMath>
-        <m:r>
-          <m:t>b</m:t>
-        </m:r>
-      </m:oMath>
-      <w:r>
-        <w:t xml:space="preserve"> </w:t>
-      </w:r>
-      <w:r>
-        <w:t xml:space="preserve">estima kLa. Se permite una ordenada al origen para revisar posibles desplazamientos temporales y desviaciones del modelo, sin forzar la recta a pasar por cero.</w:t>
-      </w:r>
-    </w:p>
-    <w:p>
-      <w:pPr>
-        <w:pStyle w:val="BodyText"/>
-        <w:jc w:val="both"/>
-      </w:pPr>
-      <w:r>
-        <w:t xml:space="preserve">La transformación requiere</w:t>
-      </w:r>
-      <w:r>
-        <w:t xml:space="preserve"> </w:t>
-      </w:r>
-      <m:oMath>
-        <m:sSub>
-          <m:e>
-            <m:r>
-              <m:t>y</m:t>
-            </m:r>
-          </m:e>
-          <m:sub>
-            <m:r>
-              <m:rPr>
-                <m:sty m:val="p"/>
-              </m:rPr>
-              <m:t>∞</m:t>
-            </m:r>
-          </m:sub>
-        </m:sSub>
-        <m:r>
-          <m:rPr>
-            <m:sty m:val="p"/>
-          </m:rPr>
-          <m:t>&gt;</m:t>
-        </m:r>
-        <m:sSub>
-          <m:e>
-            <m:r>
-              <m:t>y</m:t>
-            </m:r>
-          </m:e>
-          <m:sub>
-            <m:r>
-              <m:t>0</m:t>
-            </m:r>
-          </m:sub>
-        </m:sSub>
-      </m:oMath>
-      <w:r>
-        <w:t xml:space="preserve"> </w:t>
-      </w:r>
-      <w:r>
-        <w:t xml:space="preserve">y</w:t>
-      </w:r>
-      <w:r>
-        <w:t xml:space="preserve"> </w:t>
-      </w:r>
-      <m:oMath>
-        <m:r>
-          <m:t>y</m:t>
-        </m:r>
-        <m:r>
-          <m:rPr>
-            <m:sty m:val="p"/>
-          </m:rPr>
-          <m:t>(</m:t>
-        </m:r>
-        <m:r>
-          <m:t>t</m:t>
-        </m:r>
-        <m:r>
-          <m:rPr>
-            <m:sty m:val="p"/>
-          </m:rPr>
-          <m:t>)</m:t>
-        </m:r>
-        <m:r>
-          <m:rPr>
-            <m:sty m:val="p"/>
-          </m:rPr>
-          <m:t>&lt;</m:t>
-        </m:r>
-        <m:sSub>
-          <m:e>
-            <m:r>
-              <m:t>y</m:t>
-            </m:r>
-          </m:e>
-          <m:sub>
-            <m:r>
-              <m:rPr>
-                <m:sty m:val="p"/>
-              </m:rPr>
-              <m:t>∞</m:t>
-            </m:r>
-          </m:sub>
-        </m:sSub>
-      </m:oMath>
-      <w:r>
-        <w:t xml:space="preserve">. Cerca de la meseta, una diferencia pequeña entre lectura y equilibrio amplifica el ruido del logaritmo. No calcular el logaritmo de cero ni de valores negativos.</w:t>
-      </w:r>
-    </w:p>
-    <w:bookmarkEnd w:id="21"/>
-    <w:bookmarkEnd w:id="22"/>
-    <w:bookmarkStart w:id="23" w:name="selección-del-tramo"/>
-    <w:p>
-      <w:pPr>
-        <w:pStyle w:val="Heading2"/>
-        <w:jc w:val="both"/>
-      </w:pPr>
-      <w:r>
-        <w:t xml:space="preserve">4.3. Selección del tramo</w:t>
-      </w:r>
-    </w:p>
-    <w:p>
-      <w:pPr>
-        <w:pStyle w:val="FirstParagraph"/>
         <w:keepNext/>
         <w:jc w:val="both"/>
       </w:pPr>
       <w:r>
-        <w:t xml:space="preserve">Como criterio inicial del taller, ajustar la parte comprendida entre el 20 y el 80 % del recorrido observado:</w:t>
+        <w:t xml:space="preserve">La plantilla utiliza tiempo en segundos, por lo que kLa [h⁻¹] = 3600 × pendiente [s⁻¹]. Ajusta una recta con ordenada libre y selecciona inicialmente el tramo entre el 20 y el 80 % del recorrido:</w:t>
       </w:r>
     </w:p>
     <w:p>
@@ -2744,711 +2733,102 @@
         <w:jc w:val="both"/>
       </w:pPr>
       <w:r>
-        <w:t xml:space="preserve">Estos porcentajes corresponden al cambio entre las mesetas, no necesariamente a 20 y 80 % de saturación. Revisar que el tramo sea aproximadamente lineal, que las rpm y el aire sean constantes y que haya suficientes muestras. El intervalo es un criterio de análisis; puede requerir revisión con el instructor si el inicio tiene un retraso evidente o el ajuste muestra curvatura.</w:t>
-      </w:r>
-    </w:p>
-    <w:bookmarkEnd w:id="23"/>
-    <w:bookmarkEnd w:id="24"/>
-    <w:bookmarkStart w:id="31" w:name="protocolo-experimental"/>
-    <w:p>
-      <w:pPr>
-        <w:pStyle w:val="Heading1"/>
-        <w:jc w:val="both"/>
-      </w:pPr>
-      <w:r>
-        <w:t xml:space="preserve">5. Protocolo experimental</w:t>
-      </w:r>
-    </w:p>
-    <w:bookmarkStart w:id="28" w:name="condiciones-de-operación"/>
-    <w:p>
-      <w:pPr>
-        <w:pStyle w:val="Heading2"/>
-        <w:jc w:val="both"/>
-      </w:pPr>
-      <w:r>
-        <w:t xml:space="preserve">5.1. Condiciones de operación</w:t>
-      </w:r>
-    </w:p>
-    <w:tbl>
-      <w:tblPr>
-        <w:tblStyle w:val="Table"/>
-        <w:tblW w:type="pct" w:w="5000"/>
-        <w:jc w:val="center"/>
-        <w:tblBorders>
-          <w:top w:val="single" w:sz="4" w:space="0" w:color="B7AFC6"/>
-          <w:left w:val="single" w:sz="4" w:space="0" w:color="B7AFC6"/>
-          <w:bottom w:val="single" w:sz="4" w:space="0" w:color="B7AFC6"/>
-          <w:right w:val="single" w:sz="4" w:space="0" w:color="B7AFC6"/>
-          <w:insideH w:val="single" w:sz="4" w:space="0" w:color="B7AFC6"/>
-          <w:insideV w:val="single" w:sz="4" w:space="0" w:color="B7AFC6"/>
-        </w:tblBorders>
-        <w:tblLayout w:type="fixed"/>
-        <w:tblCellMar>
-          <w:top w:w="50" w:type="dxa"/>
-          <w:left w:w="100" w:type="dxa"/>
-          <w:bottom w:w="50" w:type="dxa"/>
-          <w:right w:w="100" w:type="dxa"/>
-        </w:tblCellMar>
-        <w:tblLook w:firstRow="1" w:lastRow="0" w:firstColumn="0" w:lastColumn="0" w:noHBand="0" w:noVBand="0" w:val="0020"/>
-      </w:tblPr>
-      <w:tblGrid>
-        <w:gridCol w:w="3960"/>
-        <w:gridCol w:w="3960"/>
-      </w:tblGrid>
-      <w:tr>
-        <w:trPr>
-          <w:cantSplit/>
-          <w:tblHeader/>
-        </w:trPr>
-        <w:tc>
-          <w:tcPr>
-            <w:shd w:val="clear" w:color="auto" w:fill="4E2891"/>
-          </w:tcPr>
-          <w:p>
-            <w:pPr>
-              <w:pStyle w:val="Compact"/>
-              <w:jc w:val="both"/>
-            </w:pPr>
-            <w:r>
-              <w:rPr>
-                <w:b/>
-                <w:color w:val="FFFFFF"/>
-              </w:rPr>
-              <w:t xml:space="preserve">Parámetro</w:t>
-            </w:r>
-          </w:p>
-        </w:tc>
-        <w:tc>
-          <w:tcPr>
-            <w:shd w:val="clear" w:color="auto" w:fill="4E2891"/>
-          </w:tcPr>
-          <w:p>
-            <w:pPr>
-              <w:pStyle w:val="Compact"/>
-              <w:jc w:val="both"/>
-            </w:pPr>
-            <w:r>
-              <w:rPr>
-                <w:b/>
-                <w:color w:val="FFFFFF"/>
-              </w:rPr>
-              <w:t xml:space="preserve">Condición</w:t>
-            </w:r>
-          </w:p>
-        </w:tc>
-      </w:tr>
-      <w:tr>
-        <w:trPr>
-          <w:cantSplit/>
-        </w:trPr>
-        <w:tc>
-          <w:tcPr/>
-          <w:p>
-            <w:pPr>
-              <w:pStyle w:val="Compact"/>
-              <w:jc w:val="both"/>
-            </w:pPr>
-            <w:r>
-              <w:t xml:space="preserve">Reactor</w:t>
-            </w:r>
-          </w:p>
-        </w:tc>
-        <w:tc>
-          <w:tcPr/>
-          <w:p>
-            <w:pPr>
-              <w:pStyle w:val="Compact"/>
-              <w:jc w:val="both"/>
-            </w:pPr>
-            <w:r>
-              <w:t xml:space="preserve">Sartorius, capacidad nominal de 50 L</w:t>
-            </w:r>
-          </w:p>
-        </w:tc>
-      </w:tr>
-      <w:tr>
-        <w:trPr>
-          <w:cantSplit/>
-        </w:trPr>
-        <w:tc>
-          <w:tcPr/>
-          <w:p>
-            <w:pPr>
-              <w:pStyle w:val="Compact"/>
-              <w:jc w:val="both"/>
-            </w:pPr>
-            <w:r>
-              <w:t xml:space="preserve">Volumen de trabajo</w:t>
-            </w:r>
-          </w:p>
-        </w:tc>
-        <w:tc>
-          <w:tcPr/>
-          <w:p>
-            <w:pPr>
-              <w:pStyle w:val="Compact"/>
-              <w:jc w:val="both"/>
-            </w:pPr>
-            <w:r>
-              <w:t xml:space="preserve">30 L de agua</w:t>
-            </w:r>
-          </w:p>
-        </w:tc>
-      </w:tr>
-      <w:tr>
-        <w:trPr>
-          <w:cantSplit/>
-        </w:trPr>
-        <w:tc>
-          <w:tcPr/>
-          <w:p>
-            <w:pPr>
-              <w:pStyle w:val="Compact"/>
-              <w:jc w:val="both"/>
-            </w:pPr>
-            <w:r>
-              <w:t xml:space="preserve">Aireación durante la reoxigenación</w:t>
-            </w:r>
-          </w:p>
-        </w:tc>
-        <w:tc>
-          <w:tcPr/>
-          <w:p>
-            <w:pPr>
-              <w:pStyle w:val="Compact"/>
-              <w:jc w:val="both"/>
-            </w:pPr>
-            <w:r>
-              <w:t xml:space="preserve">0.5 vvm constantes =</w:t>
-            </w:r>
-            <w:r>
-              <w:t xml:space="preserve"> </w:t>
-            </w:r>
-            <w:r>
-              <w:rPr>
-                <w:b/>
-                <w:bCs/>
-              </w:rPr>
-              <w:t xml:space="preserve">15 L/min</w:t>
-            </w:r>
-          </w:p>
-        </w:tc>
-      </w:tr>
-      <w:tr>
-        <w:trPr>
-          <w:cantSplit/>
-        </w:trPr>
-        <w:tc>
-          <w:tcPr/>
-          <w:p>
-            <w:pPr>
-              <w:pStyle w:val="Compact"/>
-              <w:jc w:val="both"/>
-            </w:pPr>
-            <w:r>
-              <w:t xml:space="preserve">Agitación del barrido</w:t>
-            </w:r>
-          </w:p>
-        </w:tc>
-        <w:tc>
-          <w:tcPr/>
-          <w:p>
-            <w:pPr>
-              <w:pStyle w:val="Compact"/>
-              <w:jc w:val="both"/>
-            </w:pPr>
-            <w:r>
-              <w:t xml:space="preserve">200, 400, 600, 800 y 1000 rpm</w:t>
-            </w:r>
-          </w:p>
-        </w:tc>
-      </w:tr>
-      <w:tr>
-        <w:trPr>
-          <w:cantSplit/>
-        </w:trPr>
-        <w:tc>
-          <w:tcPr/>
-          <w:p>
-            <w:pPr>
-              <w:pStyle w:val="Compact"/>
-              <w:jc w:val="both"/>
-            </w:pPr>
-            <w:r>
-              <w:t xml:space="preserve">Temperatura</w:t>
-            </w:r>
-          </w:p>
-        </w:tc>
-        <w:tc>
-          <w:tcPr/>
-          <w:p>
-            <w:pPr>
-              <w:pStyle w:val="Compact"/>
-              <w:jc w:val="both"/>
-            </w:pPr>
-            <w:r>
-              <w:t xml:space="preserve">Registrar y mantener constante durante el barrido</w:t>
-            </w:r>
-          </w:p>
-        </w:tc>
-      </w:tr>
-      <w:tr>
-        <w:trPr>
-          <w:cantSplit/>
-        </w:trPr>
-        <w:tc>
-          <w:tcPr/>
-          <w:p>
-            <w:pPr>
-              <w:pStyle w:val="Compact"/>
-              <w:jc w:val="both"/>
-            </w:pPr>
-            <w:r>
-              <w:t xml:space="preserve">Presión</w:t>
-            </w:r>
-          </w:p>
-        </w:tc>
-        <w:tc>
-          <w:tcPr/>
-          <w:p>
-            <w:pPr>
-              <w:pStyle w:val="Compact"/>
-              <w:jc w:val="both"/>
-            </w:pPr>
-            <w:r>
-              <w:t xml:space="preserve">Registrar la disponible y mantener las mismas condiciones de venteo</w:t>
-            </w:r>
-          </w:p>
-        </w:tc>
-      </w:tr>
-      <w:tr>
-        <w:trPr>
-          <w:cantSplit/>
-        </w:trPr>
-        <w:tc>
-          <w:tcPr/>
-          <w:p>
-            <w:pPr>
-              <w:pStyle w:val="Compact"/>
-              <w:jc w:val="both"/>
-            </w:pPr>
-            <w:r>
-              <w:t xml:space="preserve">Consumo biológico</w:t>
-            </w:r>
-          </w:p>
-        </w:tc>
-        <w:tc>
-          <w:tcPr/>
-          <w:p>
-            <w:pPr>
-              <w:pStyle w:val="Compact"/>
-              <w:jc w:val="both"/>
-            </w:pPr>
-            <w:r>
-              <w:t xml:space="preserve">Sin células</w:t>
-            </w:r>
-          </w:p>
-        </w:tc>
-      </w:tr>
-      <w:tr>
-        <w:trPr>
-          <w:cantSplit/>
-        </w:trPr>
-        <w:tc>
-          <w:tcPr/>
-          <w:p>
-            <w:pPr>
-              <w:pStyle w:val="Compact"/>
-              <w:jc w:val="both"/>
-            </w:pPr>
-            <w:r>
-              <w:t xml:space="preserve">Control de oxígeno</w:t>
-            </w:r>
-          </w:p>
-        </w:tc>
-        <w:tc>
-          <w:tcPr/>
-          <w:p>
-            <w:pPr>
-              <w:pStyle w:val="Compact"/>
-              <w:jc w:val="both"/>
-            </w:pPr>
-            <w:r>
-              <w:t xml:space="preserve">Desactivado; ninguna cascada debe cambiar rpm o gases</w:t>
-            </w:r>
-          </w:p>
-        </w:tc>
-      </w:tr>
-      <w:tr>
-        <w:trPr>
-          <w:cantSplit/>
-        </w:trPr>
-        <w:tc>
-          <w:tcPr/>
-          <w:p>
-            <w:pPr>
-              <w:pStyle w:val="Compact"/>
-              <w:jc w:val="both"/>
-            </w:pPr>
-            <w:r>
-              <w:t xml:space="preserve">Registro</w:t>
-            </w:r>
-          </w:p>
-        </w:tc>
-        <w:tc>
-          <w:tcPr/>
-          <w:p>
-            <w:pPr>
-              <w:pStyle w:val="Compact"/>
-              <w:jc w:val="both"/>
-            </w:pPr>
-            <w:r>
-              <w:t xml:space="preserve">Oxígeno, tiempo, rpm, caudal y temperatura; adquisición digital preferentemente cada 1 s</w:t>
-            </w:r>
-          </w:p>
-        </w:tc>
-      </w:tr>
-    </w:tbl>
-    <w:p>
-      <w:pPr>
-        <w:pStyle w:val="BodyText"/>
-        <w:spacing w:before="160"/>
-        <w:jc w:val="both"/>
-      </w:pPr>
-      <w:r>
-        <w:t xml:space="preserve">vvm expresa litros de gas por litro de líquido y minuto. El caudal se calcula con los</w:t>
+        <w:t xml:space="preserve">Estos porcentajes corresponden al cambio entre las mesetas, no necesariamente a 20 y 80 % de saturación. Revisar la linealidad y la suficiencia de las muestras. La transformación requiere</w:t>
       </w:r>
       <w:r>
         <w:t xml:space="preserve"> </w:t>
       </w:r>
-      <w:r>
-        <w:rPr>
-          <w:b/>
-          <w:bCs/>
-        </w:rPr>
-        <w:t xml:space="preserve">30 L de trabajo</w:t>
-      </w:r>
-      <w:r>
-        <w:t xml:space="preserve">, no con la capacidad nominal:</w:t>
+      <m:oMath>
+        <m:sSub>
+          <m:e>
+            <m:r>
+              <m:t>y</m:t>
+            </m:r>
+          </m:e>
+          <m:sub>
+            <m:r>
+              <m:rPr>
+                <m:sty m:val="p"/>
+              </m:rPr>
+              <m:t>∞</m:t>
+            </m:r>
+          </m:sub>
+        </m:sSub>
+        <m:r>
+          <m:rPr>
+            <m:sty m:val="p"/>
+          </m:rPr>
+          <m:t>&gt;</m:t>
+        </m:r>
+        <m:sSub>
+          <m:e>
+            <m:r>
+              <m:t>y</m:t>
+            </m:r>
+          </m:e>
+          <m:sub>
+            <m:r>
+              <m:t>0</m:t>
+            </m:r>
+          </m:sub>
+        </m:sSub>
+      </m:oMath>
+      <w:r>
+        <w:t xml:space="preserve"> </w:t>
+      </w:r>
+      <w:r>
+        <w:t xml:space="preserve">y</w:t>
       </w:r>
       <w:r>
         <w:t xml:space="preserve"> </w:t>
       </w:r>
       <m:oMath>
         <m:r>
-          <m:t>0.5</m:t>
+          <m:t>y</m:t>
         </m:r>
         <m:r>
           <m:rPr>
             <m:sty m:val="p"/>
           </m:rPr>
-          <m:t>×</m:t>
+          <m:t>(</m:t>
         </m:r>
         <m:r>
-          <m:t>30</m:t>
+          <m:t>t</m:t>
         </m:r>
         <m:r>
           <m:rPr>
             <m:sty m:val="p"/>
           </m:rPr>
-          <m:t>=</m:t>
+          <m:t>)</m:t>
         </m:r>
         <m:r>
-          <m:t>15</m:t>
+          <m:rPr>
+            <m:sty m:val="p"/>
+          </m:rPr>
+          <m:t>&lt;</m:t>
         </m:r>
+        <m:sSub>
+          <m:e>
+            <m:r>
+              <m:t>y</m:t>
+            </m:r>
+          </m:e>
+          <m:sub>
+            <m:r>
+              <m:rPr>
+                <m:sty m:val="p"/>
+              </m:rPr>
+              <m:t>∞</m:t>
+            </m:r>
+          </m:sub>
+        </m:sSub>
       </m:oMath>
       <w:r>
-        <w:t xml:space="preserve"> </w:t>
-      </w:r>
-      <w:r>
-        <w:t xml:space="preserve">L/min. Registrar la referencia del caudalímetro o controlador de flujo disponible.</w:t>
-      </w:r>
-    </w:p>
-    <w:p>
-      <w:pPr>
-        <w:pStyle w:val="BodyText"/>
-        <w:jc w:val="both"/>
-      </w:pPr>
-      <w:r>
-        <w:t xml:space="preserve">La secuencia propuesta es ascendente, con una curva independiente en cada nivel. Durante cada reoxigenación las rpm permanecen constantes. No se obtiene un kLa por nivel cambiando las rpm sobre una única curva ni aumentando la agitación cuando el agua ya está saturada.</w:t>
-      </w:r>
-    </w:p>
-    <w:p>
-      <w:pPr>
-        <w:pStyle w:val="CaptionedFigure"/>
-        <w:keepNext/>
-        <w:jc w:val="center"/>
-      </w:pPr>
-      <w:r>
-        <w:drawing>
-          <wp:inline>
-            <wp:extent cx="5040000" cy="1238787"/>
-            <wp:effectExtent b="0" l="0" r="0" t="0"/>
-            <wp:docPr descr="Secuencia del barrido a volumen y aireación constantes" title="" id="26" name="Picture"/>
-            <a:graphic>
-              <a:graphicData uri="http://schemas.openxmlformats.org/drawingml/2006/picture">
-                <pic:pic>
-                  <pic:nvPicPr>
-                    <pic:cNvPr descr="../figuras/01_barrido_kLa.png" id="27" name="Picture"/>
-                    <pic:cNvPicPr>
-                      <a:picLocks noChangeArrowheads="1" noChangeAspect="1"/>
-                    </pic:cNvPicPr>
-                  </pic:nvPicPr>
-                  <pic:blipFill>
-                    <a:blip r:embed="rId25"/>
-                    <a:stretch>
-                      <a:fillRect/>
-                    </a:stretch>
-                  </pic:blipFill>
-                  <pic:spPr bwMode="auto">
-                    <a:xfrm>
-                      <a:off x="0" y="0"/>
-                      <a:ext cx="5040000" cy="1238787"/>
-                    </a:xfrm>
-                    <a:prstGeom prst="rect">
-                      <a:avLst/>
-                    </a:prstGeom>
-                    <a:noFill/>
-                    <a:ln w="9525">
-                      <a:noFill/>
-                      <a:headEnd/>
-                      <a:tailEnd/>
-                    </a:ln>
-                  </pic:spPr>
-                </pic:pic>
-              </a:graphicData>
-            </a:graphic>
-          </wp:inline>
-        </w:drawing>
-      </w:r>
-    </w:p>
-    <w:p>
-      <w:pPr>
-        <w:pStyle w:val="ImageCaption"/>
-        <w:keepNext w:val="0"/>
-        <w:jc w:val="center"/>
-      </w:pPr>
-      <w:r>
-        <w:t xml:space="preserve">Secuencia del barrido a volumen y aireación constantes</w:t>
+        <w:t xml:space="preserve">. No calcular el logaritmo de cero ni de valores negativos.</w:t>
       </w:r>
     </w:p>
     <w:bookmarkEnd w:id="28"/>
-    <w:bookmarkStart w:id="29" w:name="organización-y-adquisición"/>
-    <w:p>
-      <w:pPr>
-        <w:pStyle w:val="Heading2"/>
-        <w:jc w:val="both"/>
-      </w:pPr>
-      <w:r>
-        <w:t xml:space="preserve">5.2. Organización y adquisición</w:t>
-      </w:r>
-    </w:p>
-    <w:p>
-      <w:pPr>
-        <w:pStyle w:val="FirstParagraph"/>
-        <w:jc w:val="both"/>
-      </w:pPr>
-      <w:r>
-        <w:t xml:space="preserve">Distribuir las tareas de operación, tiempo, adquisición, revisión de condiciones, cálculo y verificación. La maniobra de gases se realiza con el instructor.</w:t>
-      </w:r>
-    </w:p>
-    <w:tbl>
-      <w:tblPr>
-        <w:tblStyle w:val="Table"/>
-        <w:tblW w:type="pct" w:w="5000"/>
-        <w:jc w:val="center"/>
-        <w:tblBorders>
-          <w:top w:val="single" w:sz="4" w:space="0" w:color="B7AFC6"/>
-          <w:left w:val="single" w:sz="4" w:space="0" w:color="B7AFC6"/>
-          <w:bottom w:val="single" w:sz="4" w:space="0" w:color="B7AFC6"/>
-          <w:right w:val="single" w:sz="4" w:space="0" w:color="B7AFC6"/>
-          <w:insideH w:val="single" w:sz="4" w:space="0" w:color="B7AFC6"/>
-          <w:insideV w:val="single" w:sz="4" w:space="0" w:color="B7AFC6"/>
-        </w:tblBorders>
-        <w:tblLayout w:type="fixed"/>
-        <w:tblCellMar>
-          <w:top w:w="50" w:type="dxa"/>
-          <w:left w:w="100" w:type="dxa"/>
-          <w:bottom w:w="50" w:type="dxa"/>
-          <w:right w:w="100" w:type="dxa"/>
-        </w:tblCellMar>
-        <w:tblLook w:firstRow="1" w:lastRow="0" w:firstColumn="0" w:lastColumn="0" w:noHBand="0" w:noVBand="0" w:val="0020"/>
-      </w:tblPr>
-      <w:tblGrid>
-        <w:gridCol w:w="3960"/>
-        <w:gridCol w:w="3960"/>
-      </w:tblGrid>
-      <w:tr>
-        <w:trPr>
-          <w:cantSplit/>
-          <w:tblHeader/>
-        </w:trPr>
-        <w:tc>
-          <w:tcPr>
-            <w:shd w:val="clear" w:color="auto" w:fill="4E2891"/>
-          </w:tcPr>
-          <w:p>
-            <w:pPr>
-              <w:pStyle w:val="Compact"/>
-              <w:jc w:val="both"/>
-            </w:pPr>
-            <w:r>
-              <w:rPr>
-                <w:b/>
-                <w:color w:val="FFFFFF"/>
-              </w:rPr>
-              <w:t xml:space="preserve">Tiempo orientativo</w:t>
-            </w:r>
-          </w:p>
-        </w:tc>
-        <w:tc>
-          <w:tcPr>
-            <w:shd w:val="clear" w:color="auto" w:fill="4E2891"/>
-          </w:tcPr>
-          <w:p>
-            <w:pPr>
-              <w:pStyle w:val="Compact"/>
-              <w:jc w:val="both"/>
-            </w:pPr>
-            <w:r>
-              <w:rPr>
-                <w:b/>
-                <w:color w:val="FFFFFF"/>
-              </w:rPr>
-              <w:t xml:space="preserve">Actividad</w:t>
-            </w:r>
-          </w:p>
-        </w:tc>
-      </w:tr>
-      <w:tr>
-        <w:trPr>
-          <w:cantSplit/>
-        </w:trPr>
-        <w:tc>
-          <w:tcPr/>
-          <w:p>
-            <w:pPr>
-              <w:pStyle w:val="Compact"/>
-              <w:jc w:val="both"/>
-            </w:pPr>
-            <w:r>
-              <w:t xml:space="preserve">0–5 min</w:t>
-            </w:r>
-          </w:p>
-        </w:tc>
-        <w:tc>
-          <w:tcPr/>
-          <w:p>
-            <w:pPr>
-              <w:pStyle w:val="Compact"/>
-              <w:jc w:val="both"/>
-            </w:pPr>
-            <w:r>
-              <w:t xml:space="preserve">Identificar equipo y sonda; verificar volumen, aire, temperatura, adquisición y salidas en manual.</w:t>
-            </w:r>
-          </w:p>
-        </w:tc>
-      </w:tr>
-      <w:tr>
-        <w:trPr>
-          <w:cantSplit/>
-        </w:trPr>
-        <w:tc>
-          <w:tcPr/>
-          <w:p>
-            <w:pPr>
-              <w:pStyle w:val="Compact"/>
-              <w:jc w:val="both"/>
-            </w:pPr>
-            <w:r>
-              <w:t xml:space="preserve">5–30 min</w:t>
-            </w:r>
-          </w:p>
-        </w:tc>
-        <w:tc>
-          <w:tcPr/>
-          <w:p>
-            <w:pPr>
-              <w:pStyle w:val="Compact"/>
-              <w:jc w:val="both"/>
-            </w:pPr>
-            <w:r>
-              <w:t xml:space="preserve">Registrar las cinco curvas, con desoxigenación y reoxigenación en cada velocidad. Calcular conforme se obtienen los registros.</w:t>
-            </w:r>
-          </w:p>
-        </w:tc>
-      </w:tr>
-      <w:tr>
-        <w:trPr>
-          <w:cantSplit/>
-        </w:trPr>
-        <w:tc>
-          <w:tcPr/>
-          <w:p>
-            <w:pPr>
-              <w:pStyle w:val="Compact"/>
-              <w:jc w:val="both"/>
-            </w:pPr>
-            <w:r>
-              <w:t xml:space="preserve">30–40 min</w:t>
-            </w:r>
-          </w:p>
-        </w:tc>
-        <w:tc>
-          <w:tcPr/>
-          <w:p>
-            <w:pPr>
-              <w:pStyle w:val="Compact"/>
-              <w:jc w:val="both"/>
-            </w:pPr>
-            <w:r>
-              <w:t xml:space="preserve">Revisar mesetas y ajustes, completar la tabla y construir el barrido.</w:t>
-            </w:r>
-          </w:p>
-        </w:tc>
-      </w:tr>
-      <w:tr>
-        <w:trPr>
-          <w:cantSplit/>
-        </w:trPr>
-        <w:tc>
-          <w:tcPr/>
-          <w:p>
-            <w:pPr>
-              <w:pStyle w:val="Compact"/>
-              <w:jc w:val="both"/>
-            </w:pPr>
-            <w:r>
-              <w:t xml:space="preserve">40–45 min</w:t>
-            </w:r>
-          </w:p>
-        </w:tc>
-        <w:tc>
-          <w:tcPr/>
-          <w:p>
-            <w:pPr>
-              <w:pStyle w:val="Compact"/>
-              <w:jc w:val="both"/>
-            </w:pPr>
-            <w:r>
-              <w:t xml:space="preserve">Comparar resultados y documentar curvas incompletas o incidentes.</w:t>
-            </w:r>
-          </w:p>
-        </w:tc>
-      </w:tr>
-    </w:tbl>
-    <w:p>
-      <w:pPr>
-        <w:pStyle w:val="BodyText"/>
-        <w:spacing w:before="160"/>
-        <w:jc w:val="both"/>
-      </w:pPr>
-      <w:r>
-        <w:t xml:space="preserve">La adquisición del barrido se probó en el laboratorio en aproximadamente 30 minutos, según las notas de preparación del taller. Reservar hasta 45 minutos para que cada equipo complete el análisis. Los tiempos por curva dependen de la respuesta observada; no sustituir una meseta ausente por el último dato para cumplir el cronograma.</w:t>
-      </w:r>
-    </w:p>
-    <w:bookmarkEnd w:id="29"/>
-    <w:bookmarkStart w:id="30" w:name="procedimiento-por-velocidad"/>
+    <w:bookmarkStart w:id="29" w:name="procedimiento-por-velocidad"/>
     <w:p>
       <w:pPr>
         <w:pStyle w:val="Heading2"/>
@@ -3629,9 +3009,9 @@
         <w:t xml:space="preserve">Se realizará una curva por nivel como barrido de taller. Si queda tiempo, repetir una condición para examinar reproducibilidad. Una sola curva por nivel no permite estimar la variabilidad entre repeticiones.</w:t>
       </w:r>
     </w:p>
+    <w:bookmarkEnd w:id="29"/>
     <w:bookmarkEnd w:id="30"/>
-    <w:bookmarkEnd w:id="31"/>
-    <w:bookmarkStart w:id="34" w:name="registro-experimental"/>
+    <w:bookmarkStart w:id="33" w:name="registro-experimental"/>
     <w:p>
       <w:pPr>
         <w:pStyle w:val="Heading1"/>
@@ -4004,7 +3384,7 @@
         </w:tc>
       </w:tr>
     </w:tbl>
-    <w:bookmarkStart w:id="32" w:name="registro-individual-de-curva"/>
+    <w:bookmarkStart w:id="31" w:name="registro-individual-de-curva"/>
     <w:p>
       <w:pPr>
         <w:pStyle w:val="Heading2"/>
@@ -4695,8 +4075,8 @@
         <w:t xml:space="preserve">________________________________________</w:t>
       </w:r>
     </w:p>
-    <w:bookmarkEnd w:id="32"/>
-    <w:bookmarkStart w:id="33" w:name="resultados-del-barrido"/>
+    <w:bookmarkEnd w:id="31"/>
+    <w:bookmarkStart w:id="32" w:name="resultados-del-barrido"/>
     <w:p>
       <w:pPr>
         <w:pStyle w:val="Heading2"/>
@@ -5245,26 +4625,46 @@
         </w:tc>
       </w:tr>
     </w:tbl>
+    <w:bookmarkEnd w:id="32"/>
     <w:bookmarkEnd w:id="33"/>
+    <w:bookmarkStart w:id="38" w:name="variables-que-afectan-kla"/>
+    <w:p>
+      <w:pPr>
+        <w:pStyle w:val="Heading1"/>
+        <w:jc w:val="both"/>
+      </w:pPr>
+      <w:r>
+        <w:t xml:space="preserve">7. Variables que afectan kLa</w:t>
+      </w:r>
+    </w:p>
+    <w:bookmarkStart w:id="34" w:name="agitación"/>
+    <w:p>
+      <w:pPr>
+        <w:pStyle w:val="Heading2"/>
+        <w:jc w:val="both"/>
+      </w:pPr>
+      <w:r>
+        <w:t xml:space="preserve">Agitación</w:t>
+      </w:r>
+    </w:p>
+    <w:p>
+      <w:pPr>
+        <w:pStyle w:val="FirstParagraph"/>
+        <w:jc w:val="both"/>
+      </w:pPr>
+      <w:r>
+        <w:t xml:space="preserve">Al aumentar las rpm se favorece la dispersión de burbujas y se renueva la interfase gas–líquido, lo que puede incrementar kLa. El efecto depende de la geometría, la potencia suministrada y el régimen de flujo. El barrido del taller estudia esta variable entre 200 y 1000 rpm.</w:t>
+      </w:r>
+    </w:p>
     <w:bookmarkEnd w:id="34"/>
-    <w:bookmarkStart w:id="39" w:name="variables-que-afectan-kla"/>
-    <w:p>
-      <w:pPr>
-        <w:pStyle w:val="Heading1"/>
-        <w:jc w:val="both"/>
-      </w:pPr>
-      <w:r>
-        <w:t xml:space="preserve">7. Variables que afectan kLa</w:t>
-      </w:r>
-    </w:p>
-    <w:bookmarkStart w:id="35" w:name="agitación"/>
+    <w:bookmarkStart w:id="35" w:name="caudal-de-aire"/>
     <w:p>
       <w:pPr>
         <w:pStyle w:val="Heading2"/>
         <w:jc w:val="both"/>
       </w:pPr>
       <w:r>
-        <w:t xml:space="preserve">Agitación</w:t>
+        <w:t xml:space="preserve">Caudal de aire</w:t>
       </w:r>
     </w:p>
     <w:p>
@@ -5273,18 +4673,18 @@
         <w:jc w:val="both"/>
       </w:pPr>
       <w:r>
-        <w:t xml:space="preserve">Al aumentar las rpm se favorece la dispersión de burbujas y se renueva la interfase gas–líquido, lo que puede incrementar kLa. El efecto depende de la geometría, la potencia suministrada y el régimen de flujo. El barrido del taller estudia esta variable entre 200 y 1000 rpm.</w:t>
+        <w:t xml:space="preserve">Un mayor caudal suele incrementar la retención de gas y el área interfacial, aunque también puede causar coalescencia, inundación del impulsor o cambios en el régimen de dispersión. En este taller se mantiene fijo en 0.5 vvm; no se estudia su efecto de manera independiente.</w:t>
       </w:r>
     </w:p>
     <w:bookmarkEnd w:id="35"/>
-    <w:bookmarkStart w:id="36" w:name="caudal-de-aire"/>
+    <w:bookmarkStart w:id="36" w:name="geometría-y-volumen-de-trabajo"/>
     <w:p>
       <w:pPr>
         <w:pStyle w:val="Heading2"/>
         <w:jc w:val="both"/>
       </w:pPr>
       <w:r>
-        <w:t xml:space="preserve">Caudal de aire</w:t>
+        <w:t xml:space="preserve">Geometría y volumen de trabajo</w:t>
       </w:r>
     </w:p>
     <w:p>
@@ -5293,18 +4693,18 @@
         <w:jc w:val="both"/>
       </w:pPr>
       <w:r>
-        <w:t xml:space="preserve">Un mayor caudal suele incrementar la retención de gas y el área interfacial, aunque también puede causar coalescencia, inundación del impulsor o cambios en el régimen de dispersión. En este taller se mantiene fijo en 0.5 vvm; no se estudia su efecto de manera independiente.</w:t>
+        <w:t xml:space="preserve">El diámetro del tanque, el impulsor, el difusor, los deflectores y la altura del líquido modifican la circulación y la dispersión del gas. Por ello, no basta comparar las rpm de dos reactores para concluir que tienen la misma transferencia de oxígeno.</w:t>
       </w:r>
     </w:p>
     <w:bookmarkEnd w:id="36"/>
-    <w:bookmarkStart w:id="37" w:name="geometría-y-volumen-de-trabajo"/>
+    <w:bookmarkStart w:id="37" w:name="propiedades-del-medio"/>
     <w:p>
       <w:pPr>
         <w:pStyle w:val="Heading2"/>
         <w:jc w:val="both"/>
       </w:pPr>
       <w:r>
-        <w:t xml:space="preserve">Geometría y volumen de trabajo</w:t>
+        <w:t xml:space="preserve">Propiedades del medio</w:t>
       </w:r>
     </w:p>
     <w:p>
@@ -5313,32 +4713,12 @@
         <w:jc w:val="both"/>
       </w:pPr>
       <w:r>
-        <w:t xml:space="preserve">El diámetro del tanque, el impulsor, el difusor, los deflectores y la altura del líquido modifican la circulación y la dispersión del gas. Por ello, no basta comparar las rpm de dos reactores para concluir que tienen la misma transferencia de oxígeno.</w:t>
+        <w:t xml:space="preserve">La viscosidad, la tensión superficial, las sales, los antiespumantes y las proteínas pueden modificar la coalescencia de las burbujas y la transferencia de masa. Los resultados del agua no se trasladan directamente a un medio de cultivo.</w:t>
       </w:r>
     </w:p>
     <w:bookmarkEnd w:id="37"/>
-    <w:bookmarkStart w:id="38" w:name="propiedades-del-medio"/>
-    <w:p>
-      <w:pPr>
-        <w:pStyle w:val="Heading2"/>
-        <w:jc w:val="both"/>
-      </w:pPr>
-      <w:r>
-        <w:t xml:space="preserve">Propiedades del medio</w:t>
-      </w:r>
-    </w:p>
-    <w:p>
-      <w:pPr>
-        <w:pStyle w:val="FirstParagraph"/>
-        <w:jc w:val="both"/>
-      </w:pPr>
-      <w:r>
-        <w:t xml:space="preserve">La viscosidad, la tensión superficial, las sales, los antiespumantes y las proteínas pueden modificar la coalescencia de las burbujas y la transferencia de masa. Los resultados del agua no se trasladan directamente a un medio de cultivo.</w:t>
-      </w:r>
-    </w:p>
     <w:bookmarkEnd w:id="38"/>
-    <w:bookmarkEnd w:id="39"/>
-    <w:bookmarkStart w:id="40" w:name="fuentes-de-error-y-revisión-del-ajuste"/>
+    <w:bookmarkStart w:id="39" w:name="fuentes-de-error-y-revisión-del-ajuste"/>
     <w:p>
       <w:pPr>
         <w:pStyle w:val="Heading1"/>
@@ -5723,8 +5103,8 @@
         </w:tc>
       </w:tr>
     </w:tbl>
-    <w:bookmarkEnd w:id="40"/>
-    <w:bookmarkStart w:id="41" w:name="interpretación-y-entrega-de-resultados"/>
+    <w:bookmarkEnd w:id="39"/>
+    <w:bookmarkStart w:id="40" w:name="interpretación-y-entrega-de-resultados"/>
     <w:p>
       <w:pPr>
         <w:pStyle w:val="Heading1"/>
@@ -5789,8 +5169,8 @@
         <w:t xml:space="preserve">Un R² elevado no demuestra por sí solo que la medición sea válida. Revisar también curvatura, residuos, resolución temporal, estabilidad del aire y la temperatura, y respuesta de la sonda. Si la transferencia es tan rápida que la dinámica de la sonda resulta comparable, reportar el resultado como una estimación aparente y discutir la limitación.</w:t>
       </w:r>
     </w:p>
-    <w:bookmarkEnd w:id="41"/>
-    <w:bookmarkStart w:id="42" w:name="preguntas-para-la-discusión"/>
+    <w:bookmarkEnd w:id="40"/>
+    <w:bookmarkStart w:id="41" w:name="preguntas-para-la-discusión"/>
     <w:p>
       <w:pPr>
         <w:pStyle w:val="Heading1"/>
@@ -5891,8 +5271,8 @@
         <w:t xml:space="preserve">¿Por qué un kLa alto en agua no demuestra por sí solo que un cultivo CHO tendrá oxígeno suficiente?</w:t>
       </w:r>
     </w:p>
-    <w:bookmarkEnd w:id="42"/>
-    <w:bookmarkStart w:id="43" w:name="bibliografía-técnica-recomendada"/>
+    <w:bookmarkEnd w:id="41"/>
+    <w:bookmarkStart w:id="42" w:name="bibliografía-técnica-recomendada"/>
     <w:p>
       <w:pPr>
         <w:pStyle w:val="Heading1"/>
@@ -5980,7 +5360,7 @@
         <w:t xml:space="preserve">, 2.ª edición. Academic Press.</w:t>
       </w:r>
     </w:p>
-    <w:bookmarkEnd w:id="43"/>
+    <w:bookmarkEnd w:id="42"/>
     <w:sectPr>
       <w:headerReference w:type="default" r:id="rId9"/>
       <w:footerReference w:type="default" r:id="rId10"/>

</xml_diff>